<commit_message>
feat(sdd): estructura Spec-Driven Development, constitucion, plantillas y spec 001-autenticacion-roles
</commit_message>
<xml_diff>
--- a/Documentacion/aplicativo ventas.docx
+++ b/Documentacion/aplicativo ventas.docx
@@ -33,7 +33,7 @@
     </w:p>
     <w:p>
       <w:r>
-        <w:t>Estado: Borrador Inicial v13</w:t>
+        <w:t>Estado: Borrador Inicial v14</w:t>
       </w:r>
     </w:p>
     <w:p/>
@@ -117,6 +117,16 @@
         <w:t>15. Criterios de Aceptacion</w:t>
       </w:r>
     </w:p>
+    <w:p>
+      <w:r>
+        <w:t>16. Estructura SDD (Spec-Driven Development)</w:t>
+      </w:r>
+    </w:p>
+    <w:p>
+      <w:r>
+        <w:t>17. Agentes de Desarrollo</w:t>
+      </w:r>
+    </w:p>
     <w:p/>
     <w:p>
       <w:pPr>
@@ -131,6 +141,7 @@
           <w:b/>
           <w:sz w:val="32"/>
         </w:rPr>
+        <w:lastRenderedPageBreak/>
         <w:t>1. Objetivo del Sistema</w:t>
       </w:r>
     </w:p>
@@ -141,128 +152,277 @@
     </w:p>
     <w:p>
       <w:r>
+        <w:t>El sistema debe permitir:</w:t>
+      </w:r>
+    </w:p>
+    <w:p>
+      <w:pPr>
+        <w:pStyle w:val="ListBullet"/>
+      </w:pPr>
+      <w:r>
+        <w:t>Gestionar el catalogo de productos con fotos, descripciones, medidas y precios</w:t>
+      </w:r>
+    </w:p>
+    <w:p>
+      <w:pPr>
+        <w:pStyle w:val="ListBullet"/>
+      </w:pPr>
+      <w:r>
+        <w:t>Registrar ventas realizadas por cada vendedor, con control de contado y credito</w:t>
+      </w:r>
+    </w:p>
+    <w:p>
+      <w:pPr>
+        <w:pStyle w:val="ListBullet"/>
+      </w:pPr>
+      <w:r>
+        <w:t>Administrar compras a proveedores con anexos legales (facturas escaneadas, PDFs)</w:t>
+      </w:r>
+    </w:p>
+    <w:p>
+      <w:pPr>
+        <w:pStyle w:val="ListBullet"/>
+      </w:pPr>
+      <w:r>
+        <w:t>Controlar el inventario y las entradas de mercancia</w:t>
+      </w:r>
+    </w:p>
+    <w:p>
+      <w:pPr>
+        <w:pStyle w:val="ListBullet"/>
+      </w:pPr>
+      <w:r>
+        <w:t>Gestionar el dinero en caja con aprobaciones y trazabilidad completa</w:t>
+      </w:r>
+    </w:p>
+    <w:p>
+      <w:pPr>
+        <w:pStyle w:val="ListBullet"/>
+      </w:pPr>
+      <w:r>
+        <w:t>Gestionar ventas a credito con plan de cobros (semanal, mensual, quincenal)</w:t>
+      </w:r>
+    </w:p>
+    <w:p>
+      <w:pPr>
+        <w:pStyle w:val="ListBullet"/>
+      </w:pPr>
+      <w:r>
+        <w:t>Permitir a clientes externos (invitados) hacer pedidos desde el catalogo</w:t>
+      </w:r>
+    </w:p>
+    <w:p>
+      <w:pPr>
+        <w:pStyle w:val="ListBullet"/>
+      </w:pPr>
+      <w:r>
+        <w:t>Gestionar envios, entregas locales, recogidas y ventas presenciales</w:t>
+      </w:r>
+    </w:p>
+    <w:p>
+      <w:pPr>
+        <w:pStyle w:val="ListBullet"/>
+      </w:pPr>
+      <w:r>
+        <w:t>Clientes con rol propio para ver sus compras, pedidos y estado de pedidos</w:t>
+      </w:r>
+    </w:p>
+    <w:p>
+      <w:pPr>
+        <w:pStyle w:val="ListBullet"/>
+      </w:pPr>
+      <w:r>
+        <w:t>Sistema de direcciones con departamento, ciudad, direccion, barrio y GPS</w:t>
+      </w:r>
+    </w:p>
+    <w:p>
+      <w:pPr>
+        <w:pStyle w:val="ListBullet"/>
+      </w:pPr>
+      <w:r>
+        <w:t>Auditoria completa de todas las operaciones (INSERT, UPDATE, DELETE)</w:t>
+      </w:r>
+    </w:p>
+    <w:p>
+      <w:pPr>
+        <w:pStyle w:val="ListBullet"/>
+      </w:pPr>
+      <w:r>
+        <w:t>Control de acceso por roles con multiples roles por usuario</w:t>
+      </w:r>
+    </w:p>
+    <w:p>
+      <w:pPr>
+        <w:pStyle w:val="ListBullet"/>
+      </w:pPr>
+      <w:r>
+        <w:t>Sistema de logs de errores para soporte tecnico</w:t>
+      </w:r>
+    </w:p>
+    <w:p>
+      <w:pPr>
+        <w:pStyle w:val="ListBullet"/>
+      </w:pPr>
+      <w:r>
+        <w:t>Personalizacion de tema y colores por el administrador</w:t>
+      </w:r>
+    </w:p>
+    <w:p>
+      <w:pPr>
+        <w:pStyle w:val="ListBullet"/>
+      </w:pPr>
+      <w:r>
+        <w:t>Arquitectura MULTI-TENANT: una sola app para multiples empresas</w:t>
+      </w:r>
+    </w:p>
+    <w:p>
+      <w:pPr>
+        <w:pStyle w:val="ListBullet"/>
+      </w:pPr>
+    </w:p>
+    <w:p>
+      <w:pPr>
+        <w:pStyle w:val="Heading1"/>
+        <w:rPr>
+          <w:b/>
+          <w:sz w:val="32"/>
+        </w:rPr>
+      </w:pPr>
+      <w:r>
+        <w:rPr>
+          <w:b/>
+          <w:sz w:val="32"/>
+        </w:rPr>
+        <w:t>2. Plataforma y Tecnologia</w:t>
+      </w:r>
+    </w:p>
+    <w:p>
+      <w:pPr>
+        <w:pStyle w:val="Heading2"/>
+        <w:rPr>
+          <w:b/>
+          <w:sz w:val="26"/>
+        </w:rPr>
+      </w:pPr>
+      <w:r>
+        <w:rPr>
+          <w:b/>
+          <w:sz w:val="26"/>
+        </w:rPr>
+        <w:t>2.1. Frontend</w:t>
+      </w:r>
+    </w:p>
+    <w:p>
+      <w:pPr>
+        <w:pStyle w:val="ListBullet"/>
+      </w:pPr>
+      <w:r>
+        <w:t>Framework: Flutter (multiplataforma: Android, iOS y Web)</w:t>
+      </w:r>
+    </w:p>
+    <w:p>
+      <w:pPr>
+        <w:pStyle w:val="ListBullet"/>
+      </w:pPr>
+      <w:r>
+        <w:t>Unico codigo fuente para las tres plataformas</w:t>
+      </w:r>
+    </w:p>
+    <w:p>
+      <w:pPr>
+        <w:pStyle w:val="ListBullet"/>
+      </w:pPr>
+      <w:r>
+        <w:t>Diseno responsive adaptado a cada dispositivo</w:t>
+      </w:r>
+    </w:p>
+    <w:p>
+      <w:pPr>
+        <w:pStyle w:val="Heading2"/>
+        <w:rPr>
+          <w:b/>
+          <w:sz w:val="26"/>
+        </w:rPr>
+      </w:pPr>
+      <w:r>
+        <w:rPr>
+          <w:b/>
+          <w:sz w:val="26"/>
+        </w:rPr>
+        <w:t>2.2. Backend y Base de Datos</w:t>
+      </w:r>
+    </w:p>
+    <w:p>
+      <w:pPr>
+        <w:pStyle w:val="ListBullet"/>
+      </w:pPr>
+      <w:r>
+        <w:t>Firebase Firestore (base de datos NoSQL en la nube)</w:t>
+      </w:r>
+    </w:p>
+    <w:p>
+      <w:pPr>
+        <w:pStyle w:val="ListBullet"/>
+      </w:pPr>
+      <w:r>
+        <w:t>Cloud Functions para logica de servidor y triggers de auditoria</w:t>
+      </w:r>
+    </w:p>
+    <w:p>
+      <w:pPr>
+        <w:pStyle w:val="ListBullet"/>
+      </w:pPr>
+      <w:r>
+        <w:t>Firebase Authentication para gestion de usuarios</w:t>
+      </w:r>
+    </w:p>
+    <w:p>
+      <w:pPr>
+        <w:pStyle w:val="ListBullet"/>
+      </w:pPr>
+      <w:r>
+        <w:t>Firebase Storage para imagenes de productos y anexos de compras</w:t>
+      </w:r>
+    </w:p>
+    <w:p>
+      <w:pPr>
+        <w:pStyle w:val="Heading2"/>
+        <w:rPr>
+          <w:b/>
+          <w:sz w:val="26"/>
+        </w:rPr>
+      </w:pPr>
+      <w:r>
+        <w:rPr>
+          <w:b/>
+          <w:sz w:val="26"/>
+        </w:rPr>
         <w:lastRenderedPageBreak/>
-        <w:t>El sistema debe permitir:</w:t>
-      </w:r>
-    </w:p>
-    <w:p>
-      <w:pPr>
-        <w:pStyle w:val="ListBullet"/>
-      </w:pPr>
-      <w:r>
-        <w:t>Gestionar el catalogo de productos con fotos, descripciones, medidas y precios</w:t>
-      </w:r>
-    </w:p>
-    <w:p>
-      <w:pPr>
-        <w:pStyle w:val="ListBullet"/>
-      </w:pPr>
-      <w:r>
-        <w:t>Registrar ventas realizadas por cada vendedor, con control de contado y credito</w:t>
-      </w:r>
-    </w:p>
-    <w:p>
-      <w:pPr>
-        <w:pStyle w:val="ListBullet"/>
-      </w:pPr>
-      <w:r>
-        <w:t>Administrar compras a proveedores con anexos legales (facturas escaneadas, PDFs)</w:t>
-      </w:r>
-    </w:p>
-    <w:p>
-      <w:pPr>
-        <w:pStyle w:val="ListBullet"/>
-      </w:pPr>
-      <w:r>
-        <w:t>Controlar el inventario y las entradas de mercancia</w:t>
-      </w:r>
-    </w:p>
-    <w:p>
-      <w:pPr>
-        <w:pStyle w:val="ListBullet"/>
-      </w:pPr>
-      <w:r>
-        <w:t>Gestionar el dinero en caja con aprobaciones y trazabilidad completa</w:t>
-      </w:r>
-    </w:p>
-    <w:p>
-      <w:pPr>
-        <w:pStyle w:val="ListBullet"/>
-      </w:pPr>
-      <w:r>
-        <w:t>Gestionar ventas a credito con plan de cobros (semanal, mensual, quincenal)</w:t>
-      </w:r>
-    </w:p>
-    <w:p>
-      <w:pPr>
-        <w:pStyle w:val="ListBullet"/>
-      </w:pPr>
-      <w:r>
-        <w:t>Permitir a clientes externos (invitados) hacer pedidos desde el catalogo</w:t>
-      </w:r>
-    </w:p>
-    <w:p>
-      <w:pPr>
-        <w:pStyle w:val="ListBullet"/>
-      </w:pPr>
-      <w:r>
-        <w:t>Gestionar envios, entregas locales, recogidas y ventas presenciales</w:t>
-      </w:r>
-    </w:p>
-    <w:p>
-      <w:pPr>
-        <w:pStyle w:val="ListBullet"/>
-      </w:pPr>
-      <w:r>
-        <w:t>Clientes con rol propio para ver sus compras, pedidos y estado de pedidos</w:t>
-      </w:r>
-    </w:p>
-    <w:p>
-      <w:pPr>
-        <w:pStyle w:val="ListBullet"/>
-      </w:pPr>
-      <w:r>
-        <w:t>Sistema de direcciones con departamento, ciudad, direccion, barrio y GPS</w:t>
-      </w:r>
-    </w:p>
-    <w:p>
-      <w:pPr>
-        <w:pStyle w:val="ListBullet"/>
-      </w:pPr>
-      <w:r>
-        <w:t>Auditoria completa de todas las operaciones (INSERT, UPDATE, DELETE)</w:t>
-      </w:r>
-    </w:p>
-    <w:p>
-      <w:pPr>
-        <w:pStyle w:val="ListBullet"/>
-      </w:pPr>
-      <w:r>
-        <w:t>Control de acceso por roles con multiples roles por usuario</w:t>
-      </w:r>
-    </w:p>
-    <w:p>
-      <w:pPr>
-        <w:pStyle w:val="ListBullet"/>
-      </w:pPr>
-      <w:r>
-        <w:t>Sistema de logs de errores para soporte tecnico</w:t>
-      </w:r>
-    </w:p>
-    <w:p>
-      <w:pPr>
-        <w:pStyle w:val="ListBullet"/>
-      </w:pPr>
-      <w:r>
-        <w:t>Personalizacion de tema y colores por el administrador</w:t>
-      </w:r>
-    </w:p>
-    <w:p>
-      <w:pPr>
-        <w:pStyle w:val="ListBullet"/>
-      </w:pPr>
-      <w:r>
-        <w:t>Arquitectura MULTI-TENANT: una sola app para multiples empresas</w:t>
+        <w:t>2.3. Dispositivos Objetivo</w:t>
+      </w:r>
+    </w:p>
+    <w:p>
+      <w:pPr>
+        <w:pStyle w:val="ListBullet"/>
+      </w:pPr>
+      <w:r>
+        <w:t>Telefonos Android (prioridad)</w:t>
+      </w:r>
+    </w:p>
+    <w:p>
+      <w:pPr>
+        <w:pStyle w:val="ListBullet"/>
+      </w:pPr>
+      <w:r>
+        <w:t>iPhone / iOS (prioridad)</w:t>
+      </w:r>
+    </w:p>
+    <w:p>
+      <w:pPr>
+        <w:pStyle w:val="ListBullet"/>
+      </w:pPr>
+      <w:r>
+        <w:t>Navegador Web (computadores y tablets)</w:t>
       </w:r>
     </w:p>
     <w:p>
@@ -283,7 +443,76 @@
           <w:b/>
           <w:sz w:val="32"/>
         </w:rPr>
-        <w:t>2. Plataforma y Tecnologia</w:t>
+        <w:t>3. Repositorio GitHub</w:t>
+      </w:r>
+    </w:p>
+    <w:p>
+      <w:pPr>
+        <w:pStyle w:val="ListBullet"/>
+      </w:pPr>
+      <w:r>
+        <w:t>URL: git@github.com:Esteban-barrero/ventas.git</w:t>
+      </w:r>
+    </w:p>
+    <w:p>
+      <w:pPr>
+        <w:pStyle w:val="ListBullet"/>
+      </w:pPr>
+      <w:r>
+        <w:t>Plataforma: GitHub</w:t>
+      </w:r>
+    </w:p>
+    <w:p>
+      <w:pPr>
+        <w:pStyle w:val="ListBullet"/>
+      </w:pPr>
+      <w:r>
+        <w:t>Uso: Control de versiones, respaldo de codigo fuente y trabajo colaborativo</w:t>
+      </w:r>
+    </w:p>
+    <w:p>
+      <w:pPr>
+        <w:pStyle w:val="ListBullet"/>
+      </w:pPr>
+      <w:r>
+        <w:t>Ramas: main (produccion), develop (desarrollo), feature/* (nuevas funcionalidades)</w:t>
+      </w:r>
+    </w:p>
+    <w:p>
+      <w:pPr>
+        <w:pStyle w:val="ListBullet"/>
+      </w:pPr>
+      <w:r>
+        <w:t>Se recomienda el uso de Pull Requests para integrar cambios a main</w:t>
+      </w:r>
+    </w:p>
+    <w:p>
+      <w:pPr>
+        <w:pStyle w:val="ListBullet"/>
+      </w:pPr>
+      <w:r>
+        <w:t>El repositorio incluera: codigo Flutter, configuracion Firebase, Cloud Functions, documentacion</w:t>
+      </w:r>
+    </w:p>
+    <w:p>
+      <w:pPr>
+        <w:pStyle w:val="ListBullet"/>
+      </w:pPr>
+    </w:p>
+    <w:p>
+      <w:pPr>
+        <w:pStyle w:val="Heading1"/>
+        <w:rPr>
+          <w:b/>
+          <w:sz w:val="32"/>
+        </w:rPr>
+      </w:pPr>
+      <w:r>
+        <w:rPr>
+          <w:b/>
+          <w:sz w:val="32"/>
+        </w:rPr>
+        <w:t>4. Arquitectura de Base de Datos</w:t>
       </w:r>
     </w:p>
     <w:p>
@@ -299,31 +528,68 @@
           <w:b/>
           <w:sz w:val="26"/>
         </w:rPr>
-        <w:t>2.1. Frontend</w:t>
-      </w:r>
-    </w:p>
-    <w:p>
-      <w:pPr>
-        <w:pStyle w:val="ListBullet"/>
-      </w:pPr>
-      <w:r>
-        <w:t>Framework: Flutter (multiplataforma: Android, iOS y Web)</w:t>
-      </w:r>
-    </w:p>
-    <w:p>
-      <w:pPr>
-        <w:pStyle w:val="ListBullet"/>
-      </w:pPr>
-      <w:r>
-        <w:t>Unico codigo fuente para las tres plataformas</w:t>
-      </w:r>
-    </w:p>
-    <w:p>
-      <w:pPr>
-        <w:pStyle w:val="ListBullet"/>
-      </w:pPr>
-      <w:r>
-        <w:t>Diseno responsive adaptado a cada dispositivo</w:t>
+        <w:t>4.1. Seleccion de Base de Datos</w:t>
+      </w:r>
+    </w:p>
+    <w:p>
+      <w:r>
+        <w:t>Se selecciono Firebase Firestore como base de datos principal por las siguientes razones:</w:t>
+      </w:r>
+    </w:p>
+    <w:p>
+      <w:pPr>
+        <w:pStyle w:val="ListBullet"/>
+      </w:pPr>
+      <w:r>
+        <w:t>No requiere configuracion de servidores (Google lo administra)</w:t>
+      </w:r>
+    </w:p>
+    <w:p>
+      <w:pPr>
+        <w:pStyle w:val="ListBullet"/>
+      </w:pPr>
+      <w:r>
+        <w:t>Sincronizacion automatica entre dispositivos</w:t>
+      </w:r>
+    </w:p>
+    <w:p>
+      <w:pPr>
+        <w:pStyle w:val="ListBullet"/>
+      </w:pPr>
+      <w:r>
+        <w:t>Soporte offline integrado</w:t>
+      </w:r>
+    </w:p>
+    <w:p>
+      <w:pPr>
+        <w:pStyle w:val="ListBullet"/>
+      </w:pPr>
+      <w:r>
+        <w:t>Multiplatforma: Android, iOS y Web con un solo codigo</w:t>
+      </w:r>
+    </w:p>
+    <w:p>
+      <w:pPr>
+        <w:pStyle w:val="ListBullet"/>
+      </w:pPr>
+      <w:r>
+        <w:t>Escalable sin preocuparse por infraestructura</w:t>
+      </w:r>
+    </w:p>
+    <w:p>
+      <w:pPr>
+        <w:pStyle w:val="ListBullet"/>
+      </w:pPr>
+      <w:r>
+        <w:t>Tier gratuito generoso para comenzar</w:t>
+      </w:r>
+    </w:p>
+    <w:p>
+      <w:pPr>
+        <w:pStyle w:val="ListBullet"/>
+      </w:pPr>
+      <w:r>
+        <w:t>Excelente integracion con Flutter (SDK oficial)</w:t>
       </w:r>
     </w:p>
     <w:p>
@@ -339,39 +605,136 @@
           <w:b/>
           <w:sz w:val="26"/>
         </w:rPr>
-        <w:t>2.2. Backend y Base de Datos</w:t>
-      </w:r>
-    </w:p>
-    <w:p>
-      <w:pPr>
-        <w:pStyle w:val="ListBullet"/>
-      </w:pPr>
-      <w:r>
-        <w:t>Firebase Firestore (base de datos NoSQL en la nube)</w:t>
-      </w:r>
-    </w:p>
-    <w:p>
-      <w:pPr>
-        <w:pStyle w:val="ListBullet"/>
-      </w:pPr>
-      <w:r>
-        <w:t>Cloud Functions para logica de servidor y triggers de auditoria</w:t>
-      </w:r>
-    </w:p>
-    <w:p>
-      <w:pPr>
-        <w:pStyle w:val="ListBullet"/>
-      </w:pPr>
-      <w:r>
-        <w:t>Firebase Authentication para gestion de usuarios</w:t>
-      </w:r>
-    </w:p>
-    <w:p>
-      <w:pPr>
-        <w:pStyle w:val="ListBullet"/>
-      </w:pPr>
-      <w:r>
-        <w:t>Firebase Storage para imagenes de productos y anexos de compras</w:t>
+        <w:t>4.2. Estructura de Datos en Firestore</w:t>
+      </w:r>
+    </w:p>
+    <w:p>
+      <w:pPr>
+        <w:pStyle w:val="ListBullet"/>
+      </w:pPr>
+      <w:r>
+        <w:t>Coleccion empresas: datos de cada empresa (multi-tenant)</w:t>
+      </w:r>
+    </w:p>
+    <w:p>
+      <w:pPr>
+        <w:pStyle w:val="ListBullet"/>
+      </w:pPr>
+      <w:r>
+        <w:t>Coleccion usuarios: datos de cada perfil con roles y empresaId</w:t>
+      </w:r>
+    </w:p>
+    <w:p>
+      <w:pPr>
+        <w:pStyle w:val="ListBullet"/>
+      </w:pPr>
+      <w:r>
+        <w:t>Coleccion roles: definicion de cada rol y sus permisos</w:t>
+      </w:r>
+    </w:p>
+    <w:p>
+      <w:pPr>
+        <w:pStyle w:val="ListBullet"/>
+      </w:pPr>
+      <w:r>
+        <w:t>Coleccion productos: catalogo con fotos, descripciones, medidas, precios</w:t>
+      </w:r>
+    </w:p>
+    <w:p>
+      <w:pPr>
+        <w:pStyle w:val="ListBullet"/>
+      </w:pPr>
+      <w:r>
+        <w:lastRenderedPageBreak/>
+        <w:t>Coleccion clientes: datos de clientes (nombre, cedula, telefono, direccion, GPS)</w:t>
+      </w:r>
+    </w:p>
+    <w:p>
+      <w:pPr>
+        <w:pStyle w:val="ListBullet"/>
+      </w:pPr>
+      <w:r>
+        <w:t>Coleccion ventas: registro de ventas con detalle, tipo de pago, vendedor</w:t>
+      </w:r>
+    </w:p>
+    <w:p>
+      <w:pPr>
+        <w:pStyle w:val="ListBullet"/>
+      </w:pPr>
+      <w:r>
+        <w:t>Coleccion creditos: control de ventas a credito y plan de cobros</w:t>
+      </w:r>
+    </w:p>
+    <w:p>
+      <w:pPr>
+        <w:pStyle w:val="ListBullet"/>
+      </w:pPr>
+      <w:r>
+        <w:t>Coleccion pedidos: pedidos realizados por invitados</w:t>
+      </w:r>
+    </w:p>
+    <w:p>
+      <w:pPr>
+        <w:pStyle w:val="ListBullet"/>
+      </w:pPr>
+      <w:r>
+        <w:t>Coleccion proveedores: datos de proveedores</w:t>
+      </w:r>
+    </w:p>
+    <w:p>
+      <w:pPr>
+        <w:pStyle w:val="ListBullet"/>
+      </w:pPr>
+      <w:r>
+        <w:t>Coleccion compras: registro de compras con anexos legales (facturas, PDFs)</w:t>
+      </w:r>
+    </w:p>
+    <w:p>
+      <w:pPr>
+        <w:pStyle w:val="ListBullet"/>
+      </w:pPr>
+      <w:r>
+        <w:t>Coleccion inventario: control de stock y movimientos</w:t>
+      </w:r>
+    </w:p>
+    <w:p>
+      <w:pPr>
+        <w:pStyle w:val="ListBullet"/>
+      </w:pPr>
+      <w:r>
+        <w:t>Coleccion caja: entradas, salidas y arqueos de caja</w:t>
+      </w:r>
+    </w:p>
+    <w:p>
+      <w:pPr>
+        <w:pStyle w:val="ListBullet"/>
+      </w:pPr>
+      <w:r>
+        <w:t>Coleccion envios: registro de entregas con empresa, fecha, estado</w:t>
+      </w:r>
+    </w:p>
+    <w:p>
+      <w:pPr>
+        <w:pStyle w:val="ListBullet"/>
+      </w:pPr>
+      <w:r>
+        <w:t>Coleccion auditoria: registro de todas las operaciones</w:t>
+      </w:r>
+    </w:p>
+    <w:p>
+      <w:pPr>
+        <w:pStyle w:val="ListBullet"/>
+      </w:pPr>
+      <w:r>
+        <w:t>Coleccion logs_errores: registro de errores y excepciones</w:t>
+      </w:r>
+    </w:p>
+    <w:p>
+      <w:pPr>
+        <w:pStyle w:val="ListBullet"/>
+      </w:pPr>
+      <w:r>
+        <w:t>Coleccion parametros_generales: configuracion del sistema y temas</w:t>
       </w:r>
     </w:p>
     <w:p>
@@ -387,31 +750,39 @@
           <w:b/>
           <w:sz w:val="26"/>
         </w:rPr>
-        <w:t>2.3. Dispositivos Objetivo</w:t>
-      </w:r>
-    </w:p>
-    <w:p>
-      <w:pPr>
-        <w:pStyle w:val="ListBullet"/>
-      </w:pPr>
-      <w:r>
-        <w:t>Telefonos Android (prioridad)</w:t>
-      </w:r>
-    </w:p>
-    <w:p>
-      <w:pPr>
-        <w:pStyle w:val="ListBullet"/>
-      </w:pPr>
-      <w:r>
-        <w:t>iPhone / iOS (prioridad)</w:t>
-      </w:r>
-    </w:p>
-    <w:p>
-      <w:pPr>
-        <w:pStyle w:val="ListBullet"/>
-      </w:pPr>
-      <w:r>
-        <w:t>Navegador Web (computadores y tablets)</w:t>
+        <w:t>4.3. Seguridad</w:t>
+      </w:r>
+    </w:p>
+    <w:p>
+      <w:pPr>
+        <w:pStyle w:val="ListBullet"/>
+      </w:pPr>
+      <w:r>
+        <w:t>Firestore Rules: reglas de acceso por rol y empresa</w:t>
+      </w:r>
+    </w:p>
+    <w:p>
+      <w:pPr>
+        <w:pStyle w:val="ListBullet"/>
+      </w:pPr>
+      <w:r>
+        <w:t>Solo el super admin puede gestionar empresas</w:t>
+      </w:r>
+    </w:p>
+    <w:p>
+      <w:pPr>
+        <w:pStyle w:val="ListBullet"/>
+      </w:pPr>
+      <w:r>
+        <w:t>Cada empresa solo puede ver y modificar sus propios datos</w:t>
+      </w:r>
+    </w:p>
+    <w:p>
+      <w:pPr>
+        <w:pStyle w:val="ListBullet"/>
+      </w:pPr>
+      <w:r>
+        <w:t>Autenticacion por correo y contrasena o Google Sign-In</w:t>
       </w:r>
     </w:p>
     <w:p>
@@ -432,76 +803,12 @@
           <w:b/>
           <w:sz w:val="32"/>
         </w:rPr>
-        <w:t>3. Repositorio GitHub</w:t>
-      </w:r>
-    </w:p>
-    <w:p>
-      <w:pPr>
-        <w:pStyle w:val="ListBullet"/>
-      </w:pPr>
-      <w:r>
-        <w:t>URL: git@github.com:Esteban-barrero/ventas.git</w:t>
-      </w:r>
-    </w:p>
-    <w:p>
-      <w:pPr>
-        <w:pStyle w:val="ListBullet"/>
-      </w:pPr>
-      <w:r>
-        <w:t>Plataforma: GitHub</w:t>
-      </w:r>
-    </w:p>
-    <w:p>
-      <w:pPr>
-        <w:pStyle w:val="ListBullet"/>
-      </w:pPr>
-      <w:r>
-        <w:t>Uso: Control de versiones, respaldo de codigo fuente y trabajo colaborativo</w:t>
-      </w:r>
-    </w:p>
-    <w:p>
-      <w:pPr>
-        <w:pStyle w:val="ListBullet"/>
-      </w:pPr>
-      <w:r>
-        <w:t>Ramas: main (produccion), develop (desarrollo), feature/* (nuevas funcionalidades)</w:t>
-      </w:r>
-    </w:p>
-    <w:p>
-      <w:pPr>
-        <w:pStyle w:val="ListBullet"/>
-      </w:pPr>
-      <w:r>
-        <w:t>Se recomienda el uso de Pull Requests para integrar cambios a main</w:t>
-      </w:r>
-    </w:p>
-    <w:p>
-      <w:pPr>
-        <w:pStyle w:val="ListBullet"/>
-      </w:pPr>
-      <w:r>
-        <w:t>El repositorio incluera: codigo Flutter, configuracion Firebase, Cloud Functions, documentacion</w:t>
-      </w:r>
-    </w:p>
-    <w:p>
-      <w:pPr>
-        <w:pStyle w:val="ListBullet"/>
-      </w:pPr>
-    </w:p>
-    <w:p>
-      <w:pPr>
-        <w:pStyle w:val="Heading1"/>
-        <w:rPr>
-          <w:b/>
-          <w:sz w:val="32"/>
-        </w:rPr>
-      </w:pPr>
-      <w:r>
-        <w:rPr>
-          <w:b/>
-          <w:sz w:val="32"/>
-        </w:rPr>
-        <w:t>4. Arquitectura de Base de Datos</w:t>
+        <w:t>5. Arquitectura Multi-Tenant (Multiples Empresas)</w:t>
+      </w:r>
+    </w:p>
+    <w:p>
+      <w:r>
+        <w:t>La aplicacion esta disenada para ser usada por multiples empresas simultaneamente. Cada empresa tiene sus propios datos, usuarios, productos y configuraciones, completamente separados de las demas empresas.</w:t>
       </w:r>
     </w:p>
     <w:p>
@@ -517,68 +824,44 @@
           <w:b/>
           <w:sz w:val="26"/>
         </w:rPr>
-        <w:t>4.1. Seleccion de Base de Datos</w:t>
-      </w:r>
-    </w:p>
-    <w:p>
-      <w:r>
-        <w:t>Se selecciono Firebase Firestore como base de datos principal por las siguientes razones:</w:t>
-      </w:r>
-    </w:p>
-    <w:p>
-      <w:pPr>
-        <w:pStyle w:val="ListBullet"/>
-      </w:pPr>
-      <w:r>
-        <w:t>No requiere configuracion de servidores (Google lo administra)</w:t>
-      </w:r>
-    </w:p>
-    <w:p>
-      <w:pPr>
-        <w:pStyle w:val="ListBullet"/>
-      </w:pPr>
-      <w:r>
-        <w:t>Sincronizacion automatica entre dispositivos</w:t>
-      </w:r>
-    </w:p>
-    <w:p>
-      <w:pPr>
-        <w:pStyle w:val="ListBullet"/>
-      </w:pPr>
-      <w:r>
-        <w:t>Soporte offline integrado</w:t>
-      </w:r>
-    </w:p>
-    <w:p>
-      <w:pPr>
-        <w:pStyle w:val="ListBullet"/>
-      </w:pPr>
-      <w:r>
-        <w:t>Multiplatforma: Android, iOS y Web con un solo codigo</w:t>
-      </w:r>
-    </w:p>
-    <w:p>
-      <w:pPr>
-        <w:pStyle w:val="ListBullet"/>
-      </w:pPr>
-      <w:r>
-        <w:t>Escalable sin preocuparse por infraestructura</w:t>
-      </w:r>
-    </w:p>
-    <w:p>
-      <w:pPr>
-        <w:pStyle w:val="ListBullet"/>
-      </w:pPr>
-      <w:r>
-        <w:t>Tier gratuito generoso para comenzar</w:t>
-      </w:r>
-    </w:p>
-    <w:p>
-      <w:pPr>
-        <w:pStyle w:val="ListBullet"/>
-      </w:pPr>
-      <w:r>
-        <w:t>Excelente integracion con Flutter (SDK oficial)</w:t>
+        <w:t>5.1. Estrategia de Separacion de Datos</w:t>
+      </w:r>
+    </w:p>
+    <w:p>
+      <w:r>
+        <w:t>Cada documento en Firestore incluye un campo empresaId que identifica a la empresa propietaria de ese dato:</w:t>
+      </w:r>
+    </w:p>
+    <w:p>
+      <w:pPr>
+        <w:pStyle w:val="ListBullet"/>
+      </w:pPr>
+      <w:r>
+        <w:t>Campo empresaId en TODA coleccion: productos, ventas, clientes, compras, etc.</w:t>
+      </w:r>
+    </w:p>
+    <w:p>
+      <w:pPr>
+        <w:pStyle w:val="ListBullet"/>
+      </w:pPr>
+      <w:r>
+        <w:t>El sistema filtra automaticamente por empresaId en cada consulta</w:t>
+      </w:r>
+    </w:p>
+    <w:p>
+      <w:pPr>
+        <w:pStyle w:val="ListBullet"/>
+      </w:pPr>
+      <w:r>
+        <w:t>Un usuario solo ve los datos de su empresa, nunca de otras</w:t>
+      </w:r>
+    </w:p>
+    <w:p>
+      <w:pPr>
+        <w:pStyle w:val="ListBullet"/>
+      </w:pPr>
+      <w:r>
+        <w:t>Configuracion de parametros tambien es por empresa</w:t>
       </w:r>
     </w:p>
     <w:p>
@@ -594,79 +877,20 @@
           <w:b/>
           <w:sz w:val="26"/>
         </w:rPr>
-        <w:t>4.2. Estructura de Datos en Firestore</w:t>
-      </w:r>
-    </w:p>
-    <w:p>
-      <w:pPr>
-        <w:pStyle w:val="ListBullet"/>
-      </w:pPr>
-      <w:r>
-        <w:t>Coleccion empresas: datos de cada empresa (multi-tenant)</w:t>
-      </w:r>
-    </w:p>
-    <w:p>
-      <w:pPr>
-        <w:pStyle w:val="ListBullet"/>
-      </w:pPr>
-      <w:r>
-        <w:t>Coleccion usuarios: datos de cada perfil con roles y empresaId</w:t>
-      </w:r>
-    </w:p>
-    <w:p>
-      <w:pPr>
-        <w:pStyle w:val="ListBullet"/>
-      </w:pPr>
-      <w:r>
-        <w:t>Coleccion roles: definicion de cada rol y sus permisos</w:t>
-      </w:r>
-    </w:p>
-    <w:p>
-      <w:pPr>
-        <w:pStyle w:val="ListBullet"/>
-      </w:pPr>
-      <w:r>
-        <w:t>Coleccion productos: catalogo con fotos, descripciones, medidas, precios</w:t>
-      </w:r>
-    </w:p>
-    <w:p>
-      <w:pPr>
-        <w:pStyle w:val="ListBullet"/>
-      </w:pPr>
-      <w:r>
-        <w:t>Coleccion clientes: datos de clientes (nombre, cedula, telefono, direccion, GPS)</w:t>
-      </w:r>
-    </w:p>
-    <w:p>
-      <w:pPr>
-        <w:pStyle w:val="ListBullet"/>
-      </w:pPr>
-      <w:r>
-        <w:t>Coleccion ventas: registro de ventas con detalle, tipo de pago, vendedor</w:t>
-      </w:r>
-    </w:p>
-    <w:p>
-      <w:pPr>
-        <w:pStyle w:val="ListBullet"/>
-      </w:pPr>
-      <w:r>
-        <w:t>Coleccion creditos: control de ventas a credito y plan de cobros</w:t>
-      </w:r>
-    </w:p>
-    <w:p>
-      <w:pPr>
-        <w:pStyle w:val="ListBullet"/>
-      </w:pPr>
-      <w:r>
-        <w:t>Coleccion pedidos: pedidos realizados por invitados</w:t>
-      </w:r>
-    </w:p>
-    <w:p>
-      <w:pPr>
-        <w:pStyle w:val="ListBullet"/>
-      </w:pPr>
-      <w:r>
-        <w:t>Coleccion proveedores: datos de proveedores</w:t>
+        <w:t>5.2. Estructura en Firestore</w:t>
+      </w:r>
+    </w:p>
+    <w:p>
+      <w:r>
+        <w:t>Coleccion empresas:</w:t>
+      </w:r>
+    </w:p>
+    <w:p>
+      <w:pPr>
+        <w:pStyle w:val="ListBullet"/>
+      </w:pPr>
+      <w:r>
+        <w:t>{</w:t>
       </w:r>
     </w:p>
     <w:p>
@@ -675,56 +899,258 @@
       </w:pPr>
       <w:r>
         <w:lastRenderedPageBreak/>
-        <w:t>Coleccion compras: registro de compras con anexos legales (facturas, PDFs)</w:t>
-      </w:r>
-    </w:p>
-    <w:p>
-      <w:pPr>
-        <w:pStyle w:val="ListBullet"/>
-      </w:pPr>
-      <w:r>
-        <w:t>Coleccion inventario: control de stock y movimientos</w:t>
-      </w:r>
-    </w:p>
-    <w:p>
-      <w:pPr>
-        <w:pStyle w:val="ListBullet"/>
-      </w:pPr>
-      <w:r>
-        <w:t>Coleccion caja: entradas, salidas y arqueos de caja</w:t>
-      </w:r>
-    </w:p>
-    <w:p>
-      <w:pPr>
-        <w:pStyle w:val="ListBullet"/>
-      </w:pPr>
-      <w:r>
-        <w:t>Coleccion envios: registro de entregas con empresa, fecha, estado</w:t>
-      </w:r>
-    </w:p>
-    <w:p>
-      <w:pPr>
-        <w:pStyle w:val="ListBullet"/>
-      </w:pPr>
-      <w:r>
-        <w:t>Coleccion auditoria: registro de todas las operaciones</w:t>
-      </w:r>
-    </w:p>
-    <w:p>
-      <w:pPr>
-        <w:pStyle w:val="ListBullet"/>
-      </w:pPr>
-      <w:r>
-        <w:t>Coleccion logs_errores: registro de errores y excepciones</w:t>
-      </w:r>
-    </w:p>
-    <w:p>
-      <w:pPr>
-        <w:pStyle w:val="ListBullet"/>
-      </w:pPr>
-      <w:r>
-        <w:t>Coleccion parametros_generales: configuracion del sistema y temas</w:t>
-      </w:r>
+        <w:t xml:space="preserve">  "id": "empresa_001",</w:t>
+      </w:r>
+    </w:p>
+    <w:p>
+      <w:pPr>
+        <w:pStyle w:val="ListBullet"/>
+      </w:pPr>
+      <w:r>
+        <w:t xml:space="preserve">  "nombre": "Comercial ABC",</w:t>
+      </w:r>
+    </w:p>
+    <w:p>
+      <w:pPr>
+        <w:pStyle w:val="ListBullet"/>
+      </w:pPr>
+      <w:r>
+        <w:t xml:space="preserve">  "nit": "900123456",</w:t>
+      </w:r>
+    </w:p>
+    <w:p>
+      <w:pPr>
+        <w:pStyle w:val="ListBullet"/>
+      </w:pPr>
+      <w:r>
+        <w:t xml:space="preserve">  "correoNotificacion": "admin@comercialabc.com",</w:t>
+      </w:r>
+    </w:p>
+    <w:p>
+      <w:pPr>
+        <w:pStyle w:val="ListBullet"/>
+      </w:pPr>
+      <w:r>
+        <w:t xml:space="preserve">  "logo": "empresas/empresa_001/logo.png",</w:t>
+      </w:r>
+    </w:p>
+    <w:p>
+      <w:pPr>
+        <w:pStyle w:val="ListBullet"/>
+      </w:pPr>
+      <w:r>
+        <w:t xml:space="preserve">  "logoAncho": 512,</w:t>
+      </w:r>
+    </w:p>
+    <w:p>
+      <w:pPr>
+        <w:pStyle w:val="ListBullet"/>
+      </w:pPr>
+      <w:r>
+        <w:t xml:space="preserve">  "logoAlto": 512,</w:t>
+      </w:r>
+    </w:p>
+    <w:p>
+      <w:pPr>
+        <w:pStyle w:val="ListBullet"/>
+      </w:pPr>
+      <w:r>
+        <w:t xml:space="preserve">  "adminId": "user_001",</w:t>
+      </w:r>
+    </w:p>
+    <w:p>
+      <w:pPr>
+        <w:pStyle w:val="ListBullet"/>
+      </w:pPr>
+      <w:r>
+        <w:t xml:space="preserve">  "estado": "activa",</w:t>
+      </w:r>
+    </w:p>
+    <w:p>
+      <w:pPr>
+        <w:pStyle w:val="ListBullet"/>
+      </w:pPr>
+      <w:r>
+        <w:t xml:space="preserve">  "fechaCreacion": "2026-10-14",</w:t>
+      </w:r>
+    </w:p>
+    <w:p>
+      <w:pPr>
+        <w:pStyle w:val="ListBullet"/>
+      </w:pPr>
+      <w:r>
+        <w:t xml:space="preserve">  "contactoProveedor": "soporte@ventasapp.com / +57 300 000 0000",</w:t>
+      </w:r>
+    </w:p>
+    <w:p>
+      <w:pPr>
+        <w:pStyle w:val="ListBullet"/>
+      </w:pPr>
+      <w:r>
+        <w:t xml:space="preserve">  "licencia": {</w:t>
+      </w:r>
+    </w:p>
+    <w:p>
+      <w:pPr>
+        <w:pStyle w:val="ListBullet"/>
+      </w:pPr>
+      <w:r>
+        <w:t xml:space="preserve">    "tipo": "mensual",</w:t>
+      </w:r>
+    </w:p>
+    <w:p>
+      <w:pPr>
+        <w:pStyle w:val="ListBullet"/>
+      </w:pPr>
+      <w:r>
+        <w:t xml:space="preserve">    "fechaInicio": "2026-10-14",</w:t>
+      </w:r>
+    </w:p>
+    <w:p>
+      <w:pPr>
+        <w:pStyle w:val="ListBullet"/>
+      </w:pPr>
+      <w:r>
+        <w:t xml:space="preserve">    "fechaFin": "2026-11-14",</w:t>
+      </w:r>
+    </w:p>
+    <w:p>
+      <w:pPr>
+        <w:pStyle w:val="ListBullet"/>
+      </w:pPr>
+      <w:r>
+        <w:t xml:space="preserve">    "estado": "activa",</w:t>
+      </w:r>
+    </w:p>
+    <w:p>
+      <w:pPr>
+        <w:pStyle w:val="ListBullet"/>
+      </w:pPr>
+      <w:r>
+        <w:t xml:space="preserve">    "diasAvisoVencimiento": 5</w:t>
+      </w:r>
+    </w:p>
+    <w:p>
+      <w:pPr>
+        <w:pStyle w:val="ListBullet"/>
+      </w:pPr>
+      <w:r>
+        <w:t xml:space="preserve">  },</w:t>
+      </w:r>
+    </w:p>
+    <w:p>
+      <w:pPr>
+        <w:pStyle w:val="ListBullet"/>
+      </w:pPr>
+      <w:r>
+        <w:t xml:space="preserve">  "parametros": {</w:t>
+      </w:r>
+    </w:p>
+    <w:p>
+      <w:pPr>
+        <w:pStyle w:val="ListBullet"/>
+      </w:pPr>
+      <w:r>
+        <w:t xml:space="preserve">    "margenContado": 20,</w:t>
+      </w:r>
+    </w:p>
+    <w:p>
+      <w:pPr>
+        <w:pStyle w:val="ListBullet"/>
+      </w:pPr>
+      <w:r>
+        <w:t xml:space="preserve">    "margenCredito": 30,</w:t>
+      </w:r>
+    </w:p>
+    <w:p>
+      <w:pPr>
+        <w:pStyle w:val="ListBullet"/>
+      </w:pPr>
+      <w:r>
+        <w:t xml:space="preserve">    "costoEnvio": 5000,</w:t>
+      </w:r>
+    </w:p>
+    <w:p>
+      <w:pPr>
+        <w:pStyle w:val="ListBullet"/>
+      </w:pPr>
+      <w:r>
+        <w:t xml:space="preserve">    "temaActivo": "azul_naranja"</w:t>
+      </w:r>
+    </w:p>
+    <w:p>
+      <w:pPr>
+        <w:pStyle w:val="ListBullet"/>
+      </w:pPr>
+      <w:r>
+        <w:t xml:space="preserve">  }</w:t>
+      </w:r>
+    </w:p>
+    <w:p>
+      <w:pPr>
+        <w:pStyle w:val="ListBullet"/>
+      </w:pPr>
+      <w:r>
+        <w:t>}</w:t>
+      </w:r>
+    </w:p>
+    <w:p>
+      <w:r>
+        <w:t>Ejemplo en coleccion productos:</w:t>
+      </w:r>
+    </w:p>
+    <w:p>
+      <w:pPr>
+        <w:pStyle w:val="ListBullet"/>
+      </w:pPr>
+      <w:r>
+        <w:t>{</w:t>
+      </w:r>
+    </w:p>
+    <w:p>
+      <w:pPr>
+        <w:pStyle w:val="ListBullet"/>
+      </w:pPr>
+      <w:r>
+        <w:t xml:space="preserve">  "empresaId": "empresa_001",</w:t>
+      </w:r>
+    </w:p>
+    <w:p>
+      <w:pPr>
+        <w:pStyle w:val="ListBullet"/>
+      </w:pPr>
+      <w:r>
+        <w:t xml:space="preserve">  "nombre": "Producto A",</w:t>
+      </w:r>
+    </w:p>
+    <w:p>
+      <w:pPr>
+        <w:pStyle w:val="ListBullet"/>
+      </w:pPr>
+      <w:r>
+        <w:t xml:space="preserve">  "precio": 10000,</w:t>
+      </w:r>
+    </w:p>
+    <w:p>
+      <w:pPr>
+        <w:pStyle w:val="ListBullet"/>
+      </w:pPr>
+      <w:r>
+        <w:t xml:space="preserve">  "stock": 50</w:t>
+      </w:r>
+    </w:p>
+    <w:p>
+      <w:pPr>
+        <w:pStyle w:val="ListBullet"/>
+      </w:pPr>
+      <w:r>
+        <w:t>}</w:t>
+      </w:r>
+    </w:p>
+    <w:p>
+      <w:pPr>
+        <w:pStyle w:val="ListBullet"/>
+      </w:pPr>
     </w:p>
     <w:p>
       <w:pPr>
@@ -739,187 +1165,12 @@
           <w:b/>
           <w:sz w:val="26"/>
         </w:rPr>
-        <w:t>4.3. Seguridad</w:t>
-      </w:r>
-    </w:p>
-    <w:p>
-      <w:pPr>
-        <w:pStyle w:val="ListBullet"/>
-      </w:pPr>
-      <w:r>
-        <w:t>Firestore Rules: reglas de acceso por rol y empresa</w:t>
-      </w:r>
-    </w:p>
-    <w:p>
-      <w:pPr>
-        <w:pStyle w:val="ListBullet"/>
-      </w:pPr>
-      <w:r>
-        <w:t>Solo el super admin puede gestionar empresas</w:t>
-      </w:r>
-    </w:p>
-    <w:p>
-      <w:pPr>
-        <w:pStyle w:val="ListBullet"/>
-      </w:pPr>
-      <w:r>
-        <w:t>Cada empresa solo puede ver y modificar sus propios datos</w:t>
-      </w:r>
-    </w:p>
-    <w:p>
-      <w:pPr>
-        <w:pStyle w:val="ListBullet"/>
-      </w:pPr>
-      <w:r>
-        <w:t>Autenticacion por correo y contrasena o Google Sign-In</w:t>
-      </w:r>
-    </w:p>
-    <w:p>
-      <w:pPr>
-        <w:pStyle w:val="ListBullet"/>
-      </w:pPr>
-    </w:p>
-    <w:p>
-      <w:pPr>
-        <w:pStyle w:val="Heading1"/>
-        <w:rPr>
-          <w:b/>
-          <w:sz w:val="32"/>
-        </w:rPr>
-      </w:pPr>
-      <w:r>
-        <w:rPr>
-          <w:b/>
-          <w:sz w:val="32"/>
-        </w:rPr>
-        <w:t>5. Arquitectura Multi-Tenant (Multiples Empresas)</w:t>
-      </w:r>
-    </w:p>
-    <w:p>
-      <w:r>
-        <w:t>La aplicacion esta disenada para ser usada por multiples empresas simultaneamente. Cada empresa tiene sus propios datos, usuarios, productos y configuraciones, completamente separados de las demas empresas.</w:t>
-      </w:r>
-    </w:p>
-    <w:p>
-      <w:pPr>
-        <w:pStyle w:val="Heading2"/>
-        <w:rPr>
-          <w:b/>
-          <w:sz w:val="26"/>
-        </w:rPr>
-      </w:pPr>
-      <w:r>
-        <w:rPr>
-          <w:b/>
-          <w:sz w:val="26"/>
-        </w:rPr>
-        <w:t>5.1. Estrategia de Separacion de Datos</w:t>
-      </w:r>
-    </w:p>
-    <w:p>
-      <w:r>
-        <w:t>Cada documento en Firestore incluye un campo empresaId que identifica a la empresa propietaria de ese dato:</w:t>
-      </w:r>
-    </w:p>
-    <w:p>
-      <w:pPr>
-        <w:pStyle w:val="ListBullet"/>
-      </w:pPr>
-      <w:r>
-        <w:t>Campo empresaId en TODA coleccion: productos, ventas, clientes, compras, etc.</w:t>
-      </w:r>
-    </w:p>
-    <w:p>
-      <w:pPr>
-        <w:pStyle w:val="ListBullet"/>
-      </w:pPr>
-      <w:r>
-        <w:t>El sistema filtra automaticamente por empresaId en cada consulta</w:t>
-      </w:r>
-    </w:p>
-    <w:p>
-      <w:pPr>
-        <w:pStyle w:val="ListBullet"/>
-      </w:pPr>
-      <w:r>
-        <w:t>Un usuario solo ve los datos de su empresa, nunca de otras</w:t>
-      </w:r>
-    </w:p>
-    <w:p>
-      <w:pPr>
-        <w:pStyle w:val="ListBullet"/>
-      </w:pPr>
-      <w:r>
-        <w:t>Configuracion de parametros tambien es por empresa</w:t>
-      </w:r>
-    </w:p>
-    <w:p>
-      <w:pPr>
-        <w:pStyle w:val="Heading2"/>
-        <w:rPr>
-          <w:b/>
-          <w:sz w:val="26"/>
-        </w:rPr>
-      </w:pPr>
-      <w:r>
-        <w:rPr>
-          <w:b/>
-          <w:sz w:val="26"/>
-        </w:rPr>
-        <w:t>5.2. Estructura en Firestore</w:t>
-      </w:r>
-    </w:p>
-    <w:p>
-      <w:r>
-        <w:t>Coleccion empresas:</w:t>
-      </w:r>
-    </w:p>
-    <w:p>
-      <w:pPr>
-        <w:pStyle w:val="ListBullet"/>
-      </w:pPr>
-      <w:r>
-        <w:t>{</w:t>
-      </w:r>
-    </w:p>
-    <w:p>
-      <w:pPr>
-        <w:pStyle w:val="ListBullet"/>
-      </w:pPr>
-      <w:r>
-        <w:t xml:space="preserve">  "id": "empresa_001",</w:t>
-      </w:r>
-    </w:p>
-    <w:p>
-      <w:pPr>
-        <w:pStyle w:val="ListBullet"/>
-      </w:pPr>
-      <w:r>
-        <w:t xml:space="preserve">  "nombre": "Comercial ABC",</w:t>
-      </w:r>
-    </w:p>
-    <w:p>
-      <w:pPr>
-        <w:pStyle w:val="ListBullet"/>
-      </w:pPr>
-      <w:r>
-        <w:t xml:space="preserve">  "nit": "900123456",</w:t>
-      </w:r>
-    </w:p>
-    <w:p>
-      <w:pPr>
-        <w:pStyle w:val="ListBullet"/>
-      </w:pPr>
-      <w:r>
-        <w:t xml:space="preserve">  "correoNotificacion": "admin@comercialabc.com",</w:t>
-      </w:r>
-    </w:p>
-    <w:p>
-      <w:pPr>
-        <w:pStyle w:val="ListBullet"/>
-      </w:pPr>
-      <w:r>
-        <w:t xml:space="preserve">  "logo": "empresas/empresa_001/logo.png",</w:t>
+        <w:t>5.3. Flujo de Alta de Nueva Empresa</w:t>
+      </w:r>
+    </w:p>
+    <w:p>
+      <w:r>
+        <w:t>El proceso para agregar una nueva empresa al sistema:</w:t>
       </w:r>
     </w:p>
     <w:p>
@@ -928,245 +1179,6 @@
       </w:pPr>
       <w:r>
         <w:lastRenderedPageBreak/>
-        <w:t xml:space="preserve">  "logoAncho": 512,</w:t>
-      </w:r>
-    </w:p>
-    <w:p>
-      <w:pPr>
-        <w:pStyle w:val="ListBullet"/>
-      </w:pPr>
-      <w:r>
-        <w:t xml:space="preserve">  "logoAlto": 512,</w:t>
-      </w:r>
-    </w:p>
-    <w:p>
-      <w:pPr>
-        <w:pStyle w:val="ListBullet"/>
-      </w:pPr>
-      <w:r>
-        <w:t xml:space="preserve">  "adminId": "user_001",</w:t>
-      </w:r>
-    </w:p>
-    <w:p>
-      <w:pPr>
-        <w:pStyle w:val="ListBullet"/>
-      </w:pPr>
-      <w:r>
-        <w:t xml:space="preserve">  "estado": "activa",</w:t>
-      </w:r>
-    </w:p>
-    <w:p>
-      <w:pPr>
-        <w:pStyle w:val="ListBullet"/>
-      </w:pPr>
-      <w:r>
-        <w:t xml:space="preserve">  "fechaCreacion": "2026-10-14",</w:t>
-      </w:r>
-    </w:p>
-    <w:p>
-      <w:pPr>
-        <w:pStyle w:val="ListBullet"/>
-      </w:pPr>
-      <w:r>
-        <w:t xml:space="preserve">  "contactoProveedor": "soporte@ventasapp.com / +57 300 000 0000",</w:t>
-      </w:r>
-    </w:p>
-    <w:p>
-      <w:pPr>
-        <w:pStyle w:val="ListBullet"/>
-      </w:pPr>
-      <w:r>
-        <w:t xml:space="preserve">  "licencia": {</w:t>
-      </w:r>
-    </w:p>
-    <w:p>
-      <w:pPr>
-        <w:pStyle w:val="ListBullet"/>
-      </w:pPr>
-      <w:r>
-        <w:t xml:space="preserve">    "tipo": "mensual",</w:t>
-      </w:r>
-    </w:p>
-    <w:p>
-      <w:pPr>
-        <w:pStyle w:val="ListBullet"/>
-      </w:pPr>
-      <w:r>
-        <w:t xml:space="preserve">    "fechaInicio": "2026-10-14",</w:t>
-      </w:r>
-    </w:p>
-    <w:p>
-      <w:pPr>
-        <w:pStyle w:val="ListBullet"/>
-      </w:pPr>
-      <w:r>
-        <w:t xml:space="preserve">    "fechaFin": "2026-11-14",</w:t>
-      </w:r>
-    </w:p>
-    <w:p>
-      <w:pPr>
-        <w:pStyle w:val="ListBullet"/>
-      </w:pPr>
-      <w:r>
-        <w:t xml:space="preserve">    "estado": "activa",</w:t>
-      </w:r>
-    </w:p>
-    <w:p>
-      <w:pPr>
-        <w:pStyle w:val="ListBullet"/>
-      </w:pPr>
-      <w:r>
-        <w:t xml:space="preserve">    "diasAvisoVencimiento": 5</w:t>
-      </w:r>
-    </w:p>
-    <w:p>
-      <w:pPr>
-        <w:pStyle w:val="ListBullet"/>
-      </w:pPr>
-      <w:r>
-        <w:t xml:space="preserve">  },</w:t>
-      </w:r>
-    </w:p>
-    <w:p>
-      <w:pPr>
-        <w:pStyle w:val="ListBullet"/>
-      </w:pPr>
-      <w:r>
-        <w:t xml:space="preserve">  "parametros": {</w:t>
-      </w:r>
-    </w:p>
-    <w:p>
-      <w:pPr>
-        <w:pStyle w:val="ListBullet"/>
-      </w:pPr>
-      <w:r>
-        <w:t xml:space="preserve">    "margenContado": 20,</w:t>
-      </w:r>
-    </w:p>
-    <w:p>
-      <w:pPr>
-        <w:pStyle w:val="ListBullet"/>
-      </w:pPr>
-      <w:r>
-        <w:t xml:space="preserve">    "margenCredito": 30,</w:t>
-      </w:r>
-    </w:p>
-    <w:p>
-      <w:pPr>
-        <w:pStyle w:val="ListBullet"/>
-      </w:pPr>
-      <w:r>
-        <w:t xml:space="preserve">    "costoEnvio": 5000,</w:t>
-      </w:r>
-    </w:p>
-    <w:p>
-      <w:pPr>
-        <w:pStyle w:val="ListBullet"/>
-      </w:pPr>
-      <w:r>
-        <w:t xml:space="preserve">    "temaActivo": "azul_naranja"</w:t>
-      </w:r>
-    </w:p>
-    <w:p>
-      <w:pPr>
-        <w:pStyle w:val="ListBullet"/>
-      </w:pPr>
-      <w:r>
-        <w:t xml:space="preserve">  }</w:t>
-      </w:r>
-    </w:p>
-    <w:p>
-      <w:pPr>
-        <w:pStyle w:val="ListBullet"/>
-      </w:pPr>
-      <w:r>
-        <w:t>}</w:t>
-      </w:r>
-    </w:p>
-    <w:p>
-      <w:r>
-        <w:t>Ejemplo en coleccion productos:</w:t>
-      </w:r>
-    </w:p>
-    <w:p>
-      <w:pPr>
-        <w:pStyle w:val="ListBullet"/>
-      </w:pPr>
-      <w:r>
-        <w:t>{</w:t>
-      </w:r>
-    </w:p>
-    <w:p>
-      <w:pPr>
-        <w:pStyle w:val="ListBullet"/>
-      </w:pPr>
-      <w:r>
-        <w:t xml:space="preserve">  "empresaId": "empresa_001",</w:t>
-      </w:r>
-    </w:p>
-    <w:p>
-      <w:pPr>
-        <w:pStyle w:val="ListBullet"/>
-      </w:pPr>
-      <w:r>
-        <w:t xml:space="preserve">  "nombre": "Producto A",</w:t>
-      </w:r>
-    </w:p>
-    <w:p>
-      <w:pPr>
-        <w:pStyle w:val="ListBullet"/>
-      </w:pPr>
-      <w:r>
-        <w:t xml:space="preserve">  "precio": 10000,</w:t>
-      </w:r>
-    </w:p>
-    <w:p>
-      <w:pPr>
-        <w:pStyle w:val="ListBullet"/>
-      </w:pPr>
-      <w:r>
-        <w:t xml:space="preserve">  "stock": 50</w:t>
-      </w:r>
-    </w:p>
-    <w:p>
-      <w:pPr>
-        <w:pStyle w:val="ListBullet"/>
-      </w:pPr>
-      <w:r>
-        <w:t>}</w:t>
-      </w:r>
-    </w:p>
-    <w:p>
-      <w:pPr>
-        <w:pStyle w:val="ListBullet"/>
-      </w:pPr>
-    </w:p>
-    <w:p>
-      <w:pPr>
-        <w:pStyle w:val="Heading2"/>
-        <w:rPr>
-          <w:b/>
-          <w:sz w:val="26"/>
-        </w:rPr>
-      </w:pPr>
-      <w:r>
-        <w:rPr>
-          <w:b/>
-          <w:sz w:val="26"/>
-        </w:rPr>
-        <w:t>5.3. Flujo de Alta de Nueva Empresa</w:t>
-      </w:r>
-    </w:p>
-    <w:p>
-      <w:r>
-        <w:t>El proceso para agregar una nueva empresa al sistema:</w:t>
-      </w:r>
-    </w:p>
-    <w:p>
-      <w:pPr>
-        <w:pStyle w:val="ListBullet"/>
-      </w:pPr>
-      <w:r>
         <w:t>Paso 1: El Super Admin entra al modulo Gestion de Empresas</w:t>
       </w:r>
     </w:p>
@@ -1199,7 +1211,6 @@
         <w:pStyle w:val="ListBullet"/>
       </w:pPr>
       <w:r>
-        <w:lastRenderedPageBreak/>
         <w:t>Paso 3: El sistema crea automaticamente:</w:t>
       </w:r>
     </w:p>
@@ -1456,6 +1467,7 @@
         <w:pStyle w:val="ListBullet"/>
       </w:pPr>
       <w:r>
+        <w:lastRenderedPageBreak/>
         <w:t>Acceder a la configuracion global del sistema</w:t>
       </w:r>
     </w:p>
@@ -1477,7 +1489,6 @@
           <w:b/>
           <w:sz w:val="26"/>
         </w:rPr>
-        <w:lastRenderedPageBreak/>
         <w:t>5.6. Licencia, Planes y Facturacion por Empresa</w:t>
       </w:r>
     </w:p>
@@ -1728,6 +1739,7 @@
           <w:b/>
           <w:sz w:val="24"/>
         </w:rPr>
+        <w:lastRenderedPageBreak/>
         <w:t>5.6.4. Gestion de Planes (Super Admin)</w:t>
       </w:r>
     </w:p>
@@ -1943,6 +1955,7 @@
         <w:pStyle w:val="ListBullet"/>
       </w:pPr>
       <w:r>
+        <w:lastRenderedPageBreak/>
         <w:t>Tamano minimo aceptado: 256 x 256 pixeles</w:t>
       </w:r>
     </w:p>
@@ -2190,6 +2203,7 @@
           <w:b/>
           <w:sz w:val="26"/>
         </w:rPr>
+        <w:lastRenderedPageBreak/>
         <w:t>6.2. Estructura del Registro de Auditoria</w:t>
       </w:r>
     </w:p>
@@ -2458,6 +2472,7 @@
         <w:pStyle w:val="ListBullet"/>
       </w:pPr>
       <w:r>
+        <w:lastRenderedPageBreak/>
         <w:t>Acceso total al sistema</w:t>
       </w:r>
     </w:p>
@@ -2754,6 +2769,7 @@
           <w:b/>
           <w:sz w:val="24"/>
         </w:rPr>
+        <w:lastRenderedPageBreak/>
         <w:t>7.1.9. Developer</w:t>
       </w:r>
     </w:p>
@@ -3036,6 +3052,7 @@
         <w:pStyle w:val="ListBullet"/>
       </w:pPr>
       <w:r>
+        <w:lastRenderedPageBreak/>
         <w:t>Accesibilidad: buen contraste, toque minimo 48x48px</w:t>
       </w:r>
     </w:p>
@@ -5550,6 +5567,894 @@
       <w:r>
         <w:t>Los formularios no deben mostrarse a roles sin permiso</w:t>
       </w:r>
+    </w:p>
+    <w:p>
+      <w:pPr>
+        <w:pStyle w:val="ListBullet"/>
+      </w:pPr>
+    </w:p>
+    <w:p>
+      <w:pPr>
+        <w:pStyle w:val="Heading1"/>
+        <w:rPr>
+          <w:b/>
+          <w:sz w:val="32"/>
+        </w:rPr>
+      </w:pPr>
+      <w:r>
+        <w:rPr>
+          <w:b/>
+          <w:sz w:val="32"/>
+        </w:rPr>
+        <w:t>16. Estructura SDD (Spec-Driven Development)</w:t>
+      </w:r>
+    </w:p>
+    <w:p>
+      <w:r>
+        <w:t>El proyecto se desarrollara siguiendo la metodologia SDD (Spec-Driven Development, Desarrollo Guiado por Especificaciones). Consiste en escribir y mantener la ESPECIFICACION antes y durante el desarrollo, para que tanto los agentes de IA como los desarrolladores trabajen a partir de una unica fuente de verdad.</w:t>
+      </w:r>
+    </w:p>
+    <w:p>
+      <w:pPr>
+        <w:pStyle w:val="Heading2"/>
+        <w:rPr>
+          <w:b/>
+          <w:sz w:val="26"/>
+        </w:rPr>
+      </w:pPr>
+      <w:r>
+        <w:rPr>
+          <w:b/>
+          <w:sz w:val="26"/>
+        </w:rPr>
+        <w:t>16.1. Por que usar SDD</w:t>
+      </w:r>
+    </w:p>
+    <w:p>
+      <w:pPr>
+        <w:pStyle w:val="ListBullet"/>
+      </w:pPr>
+      <w:r>
+        <w:t>Una sola fuente de verdad: la especificacion manda</w:t>
+      </w:r>
+    </w:p>
+    <w:p>
+      <w:pPr>
+        <w:pStyle w:val="ListBullet"/>
+      </w:pPr>
+      <w:r>
+        <w:t>Los agentes de IA generan codigo a partir de especificaciones claras</w:t>
+      </w:r>
+    </w:p>
+    <w:p>
+      <w:pPr>
+        <w:pStyle w:val="ListBullet"/>
+      </w:pPr>
+      <w:r>
+        <w:t>Menos retrabajo: se define el QUE y el POR QUE antes del COMO</w:t>
+      </w:r>
+    </w:p>
+    <w:p>
+      <w:pPr>
+        <w:pStyle w:val="ListBullet"/>
+      </w:pPr>
+      <w:r>
+        <w:t>Trazabilidad: cada funcionalidad nace de una especificacion</w:t>
+      </w:r>
+    </w:p>
+    <w:p>
+      <w:pPr>
+        <w:pStyle w:val="ListBullet"/>
+      </w:pPr>
+      <w:r>
+        <w:t>Documentacion viva: la especificacion se actualiza junto con el proyecto</w:t>
+      </w:r>
+    </w:p>
+    <w:p>
+      <w:pPr>
+        <w:pStyle w:val="Heading2"/>
+        <w:rPr>
+          <w:b/>
+          <w:sz w:val="26"/>
+        </w:rPr>
+      </w:pPr>
+      <w:r>
+        <w:rPr>
+          <w:b/>
+          <w:sz w:val="26"/>
+        </w:rPr>
+        <w:t>16.2. Estructura de Carpetas</w:t>
+      </w:r>
+    </w:p>
+    <w:p>
+      <w:r>
+        <w:t>Estructura propuesta en el repositorio (raiz del proyecto):</w:t>
+      </w:r>
+    </w:p>
+    <w:p>
+      <w:pPr>
+        <w:pStyle w:val="ListBullet"/>
+      </w:pPr>
+      <w:r>
+        <w:t>AGENTS.md - Guia e instrucciones para los agentes de IA</w:t>
+      </w:r>
+    </w:p>
+    <w:p>
+      <w:pPr>
+        <w:pStyle w:val="ListBullet"/>
+      </w:pPr>
+      <w:r>
+        <w:t>.specify/ - Configuracion de la metodologia SDD</w:t>
+      </w:r>
+    </w:p>
+    <w:p>
+      <w:pPr>
+        <w:pStyle w:val="ListBullet"/>
+      </w:pPr>
+      <w:r>
+        <w:t>.specify/memory/constitution.md - Constitucion del proyecto (principios no negociables)</w:t>
+      </w:r>
+    </w:p>
+    <w:p>
+      <w:pPr>
+        <w:pStyle w:val="ListBullet"/>
+      </w:pPr>
+      <w:r>
+        <w:t>.specify/templates/spec-template.md - Plantilla de especificacion</w:t>
+      </w:r>
+    </w:p>
+    <w:p>
+      <w:pPr>
+        <w:pStyle w:val="ListBullet"/>
+      </w:pPr>
+      <w:r>
+        <w:t>.specify/templates/plan-template.md - Plantilla de plan tecnico</w:t>
+      </w:r>
+    </w:p>
+    <w:p>
+      <w:pPr>
+        <w:pStyle w:val="ListBullet"/>
+      </w:pPr>
+      <w:r>
+        <w:t>.specify/templates/tasks-template.md - Plantilla de tareas</w:t>
+      </w:r>
+    </w:p>
+    <w:p>
+      <w:pPr>
+        <w:pStyle w:val="ListBullet"/>
+      </w:pPr>
+      <w:r>
+        <w:t>specs/ - Una carpeta por funcionalidad</w:t>
+      </w:r>
+    </w:p>
+    <w:p>
+      <w:pPr>
+        <w:pStyle w:val="ListBullet"/>
+      </w:pPr>
+      <w:r>
+        <w:t>specs/001-nombre-funcionalidad/spec.md - Especificacion (QUE y POR QUE)</w:t>
+      </w:r>
+    </w:p>
+    <w:p>
+      <w:pPr>
+        <w:pStyle w:val="ListBullet"/>
+      </w:pPr>
+      <w:r>
+        <w:t>specs/001-nombre-funcionalidad/plan.md - Plan tecnico (COMO)</w:t>
+      </w:r>
+    </w:p>
+    <w:p>
+      <w:pPr>
+        <w:pStyle w:val="ListBullet"/>
+      </w:pPr>
+      <w:r>
+        <w:t>specs/001-nombre-funcionalidad/tasks.md - Lista de tareas</w:t>
+      </w:r>
+    </w:p>
+    <w:p>
+      <w:pPr>
+        <w:pStyle w:val="ListBullet"/>
+      </w:pPr>
+      <w:r>
+        <w:t>specs/001-nombre-funcionalidad/research.md - Investigacion y decisiones</w:t>
+      </w:r>
+    </w:p>
+    <w:p>
+      <w:pPr>
+        <w:pStyle w:val="ListBullet"/>
+      </w:pPr>
+      <w:r>
+        <w:t>specs/001-nombre-funcionalidad/data-model.md - Modelo de datos</w:t>
+      </w:r>
+    </w:p>
+    <w:p>
+      <w:pPr>
+        <w:pStyle w:val="ListBullet"/>
+      </w:pPr>
+      <w:r>
+        <w:t>specs/001-nombre-funcionalidad/contracts/ - Contratos de API e interfaces</w:t>
+      </w:r>
+    </w:p>
+    <w:p>
+      <w:pPr>
+        <w:pStyle w:val="ListBullet"/>
+      </w:pPr>
+      <w:r>
+        <w:t>specs/001-nombre-funcionalidad/quickstart.md - Guia rapida de la funcionalidad</w:t>
+      </w:r>
+    </w:p>
+    <w:p>
+      <w:pPr>
+        <w:pStyle w:val="Heading2"/>
+        <w:rPr>
+          <w:b/>
+          <w:sz w:val="26"/>
+        </w:rPr>
+      </w:pPr>
+      <w:r>
+        <w:rPr>
+          <w:b/>
+          <w:sz w:val="26"/>
+        </w:rPr>
+        <w:t>16.3. Fases del SDD</w:t>
+      </w:r>
+    </w:p>
+    <w:p>
+      <w:r>
+        <w:t>El flujo de trabajo sigue 5 fases:</w:t>
+      </w:r>
+    </w:p>
+    <w:p>
+      <w:pPr>
+        <w:pStyle w:val="ListBullet"/>
+      </w:pPr>
+      <w:r>
+        <w:t>Fase 0 - Constitucion: definir los principios del proyecto</w:t>
+      </w:r>
+    </w:p>
+    <w:p>
+      <w:pPr>
+        <w:pStyle w:val="ListBullet"/>
+      </w:pPr>
+      <w:r>
+        <w:t>Fase 1 - Especificar (spec.md): que se quiere y por que, sin detalles tecnicos</w:t>
+      </w:r>
+    </w:p>
+    <w:p>
+      <w:pPr>
+        <w:pStyle w:val="ListBullet"/>
+      </w:pPr>
+      <w:r>
+        <w:t>Fase 2 - Planificar (plan.md): como se construira (arquitectura, tecnologia)</w:t>
+      </w:r>
+    </w:p>
+    <w:p>
+      <w:pPr>
+        <w:pStyle w:val="ListBullet"/>
+      </w:pPr>
+      <w:r>
+        <w:t>Fase 3 - Desglosar (tasks.md): dividir en tareas pequenas y ordenadas</w:t>
+      </w:r>
+    </w:p>
+    <w:p>
+      <w:pPr>
+        <w:pStyle w:val="ListBullet"/>
+      </w:pPr>
+      <w:r>
+        <w:t>Fase 4 - Implementar: el agente o desarrollador ejecuta las tareas una por una</w:t>
+      </w:r>
+    </w:p>
+    <w:p>
+      <w:pPr>
+        <w:pStyle w:val="Heading2"/>
+        <w:rPr>
+          <w:b/>
+          <w:sz w:val="26"/>
+        </w:rPr>
+      </w:pPr>
+      <w:r>
+        <w:rPr>
+          <w:b/>
+          <w:sz w:val="26"/>
+        </w:rPr>
+        <w:t>16.4. Contenido de Cada Artefacto</w:t>
+      </w:r>
+    </w:p>
+    <w:p>
+      <w:pPr>
+        <w:pStyle w:val="Heading3"/>
+        <w:rPr>
+          <w:b/>
+          <w:sz w:val="24"/>
+        </w:rPr>
+      </w:pPr>
+      <w:r>
+        <w:rPr>
+          <w:b/>
+          <w:sz w:val="24"/>
+        </w:rPr>
+        <w:t>16.4.1. constitution.md (Constitucion)</w:t>
+      </w:r>
+    </w:p>
+    <w:p>
+      <w:pPr>
+        <w:pStyle w:val="ListBullet"/>
+      </w:pPr>
+      <w:r>
+        <w:t>Principios no negociables del proyecto</w:t>
+      </w:r>
+    </w:p>
+    <w:p>
+      <w:pPr>
+        <w:pStyle w:val="ListBullet"/>
+      </w:pPr>
+      <w:r>
+        <w:t>Ejemplo: Flutter + Firebase, multi-tenant, RBAC, auditoria obligatoria</w:t>
+      </w:r>
+    </w:p>
+    <w:p>
+      <w:pPr>
+        <w:pStyle w:val="ListBullet"/>
+      </w:pPr>
+      <w:r>
+        <w:t>Estandares de codigo, pruebas y documentacion</w:t>
+      </w:r>
+    </w:p>
+    <w:p>
+      <w:pPr>
+        <w:pStyle w:val="ListBullet"/>
+      </w:pPr>
+      <w:r>
+        <w:t>Reglas de seguridad y manejo de datos</w:t>
+      </w:r>
+    </w:p>
+    <w:p>
+      <w:pPr>
+        <w:pStyle w:val="Heading3"/>
+        <w:rPr>
+          <w:b/>
+          <w:sz w:val="24"/>
+        </w:rPr>
+      </w:pPr>
+      <w:r>
+        <w:rPr>
+          <w:b/>
+          <w:sz w:val="24"/>
+        </w:rPr>
+        <w:t>16.4.2. spec.md (Especificacion)</w:t>
+      </w:r>
+    </w:p>
+    <w:p>
+      <w:pPr>
+        <w:pStyle w:val="ListBullet"/>
+      </w:pPr>
+      <w:r>
+        <w:t>Descripcion o historia de la funcionalidad</w:t>
+      </w:r>
+    </w:p>
+    <w:p>
+      <w:pPr>
+        <w:pStyle w:val="ListBullet"/>
+      </w:pPr>
+      <w:r>
+        <w:t>Criterios de aceptacion (como se que esta bien)</w:t>
+      </w:r>
+    </w:p>
+    <w:p>
+      <w:pPr>
+        <w:pStyle w:val="ListBullet"/>
+      </w:pPr>
+      <w:r>
+        <w:t>Casos de uso y actores involucrados</w:t>
+      </w:r>
+    </w:p>
+    <w:p>
+      <w:pPr>
+        <w:pStyle w:val="ListBullet"/>
+      </w:pPr>
+      <w:r>
+        <w:t>Reglas de negocio y validaciones</w:t>
+      </w:r>
+    </w:p>
+    <w:p>
+      <w:pPr>
+        <w:pStyle w:val="ListBullet"/>
+      </w:pPr>
+      <w:r>
+        <w:t>Fuera de alcance de esa funcionalidad</w:t>
+      </w:r>
+    </w:p>
+    <w:p>
+      <w:pPr>
+        <w:pStyle w:val="Heading3"/>
+        <w:rPr>
+          <w:b/>
+          <w:sz w:val="24"/>
+        </w:rPr>
+      </w:pPr>
+      <w:r>
+        <w:rPr>
+          <w:b/>
+          <w:sz w:val="24"/>
+        </w:rPr>
+        <w:t>16.4.3. plan.md (Plan Tecnico)</w:t>
+      </w:r>
+    </w:p>
+    <w:p>
+      <w:pPr>
+        <w:pStyle w:val="ListBullet"/>
+      </w:pPr>
+      <w:r>
+        <w:t>Arquitectura de la solucion</w:t>
+      </w:r>
+    </w:p>
+    <w:p>
+      <w:pPr>
+        <w:pStyle w:val="ListBullet"/>
+      </w:pPr>
+      <w:r>
+        <w:t>Modelo de datos afectado</w:t>
+      </w:r>
+    </w:p>
+    <w:p>
+      <w:pPr>
+        <w:pStyle w:val="ListBullet"/>
+      </w:pPr>
+      <w:r>
+        <w:t>Tecnologias y librerias a usar</w:t>
+      </w:r>
+    </w:p>
+    <w:p>
+      <w:pPr>
+        <w:pStyle w:val="ListBullet"/>
+      </w:pPr>
+      <w:r>
+        <w:t>Contratos y dependencias entre modulos</w:t>
+      </w:r>
+    </w:p>
+    <w:p>
+      <w:pPr>
+        <w:pStyle w:val="Heading3"/>
+        <w:rPr>
+          <w:b/>
+          <w:sz w:val="24"/>
+        </w:rPr>
+      </w:pPr>
+      <w:r>
+        <w:rPr>
+          <w:b/>
+          <w:sz w:val="24"/>
+        </w:rPr>
+        <w:t>16.4.4. tasks.md (Tareas)</w:t>
+      </w:r>
+    </w:p>
+    <w:p>
+      <w:pPr>
+        <w:pStyle w:val="ListBullet"/>
+      </w:pPr>
+      <w:r>
+        <w:t>Lista ordenada de tareas ejecutables</w:t>
+      </w:r>
+    </w:p>
+    <w:p>
+      <w:pPr>
+        <w:pStyle w:val="ListBullet"/>
+      </w:pPr>
+      <w:r>
+        <w:t>Cada tarea: descripcion, archivos afectados y criterio de terminado</w:t>
+      </w:r>
+    </w:p>
+    <w:p>
+      <w:pPr>
+        <w:pStyle w:val="ListBullet"/>
+      </w:pPr>
+      <w:r>
+        <w:t>Se marcan como pendientes o completadas durante el desarrollo</w:t>
+      </w:r>
+    </w:p>
+    <w:p>
+      <w:pPr>
+        <w:pStyle w:val="Heading2"/>
+        <w:rPr>
+          <w:b/>
+          <w:sz w:val="26"/>
+        </w:rPr>
+      </w:pPr>
+      <w:r>
+        <w:rPr>
+          <w:b/>
+          <w:sz w:val="26"/>
+        </w:rPr>
+        <w:t>16.5. Nomenclatura de Funcionalidades</w:t>
+      </w:r>
+    </w:p>
+    <w:p>
+      <w:pPr>
+        <w:pStyle w:val="ListBullet"/>
+      </w:pPr>
+      <w:r>
+        <w:t>Cada funcionalidad tiene una carpeta numerada: 001, 002, 003...</w:t>
+      </w:r>
+    </w:p>
+    <w:p>
+      <w:pPr>
+        <w:pStyle w:val="ListBullet"/>
+      </w:pPr>
+      <w:r>
+        <w:t>Formato: numero + nombre corto (ej: 001-catalogo-productos)</w:t>
+      </w:r>
+    </w:p>
+    <w:p>
+      <w:pPr>
+        <w:pStyle w:val="ListBullet"/>
+      </w:pPr>
+      <w:r>
+        <w:t>El numero indica el orden de desarrollo</w:t>
+      </w:r>
+    </w:p>
+    <w:p>
+      <w:pPr>
+        <w:pStyle w:val="ListBullet"/>
+      </w:pPr>
+      <w:r>
+        <w:t>Las funcionalidades terminadas no se borran: se conserva el historico</w:t>
+      </w:r>
+    </w:p>
+    <w:p>
+      <w:pPr>
+        <w:pStyle w:val="Heading2"/>
+        <w:rPr>
+          <w:b/>
+          <w:sz w:val="26"/>
+        </w:rPr>
+      </w:pPr>
+      <w:r>
+        <w:rPr>
+          <w:b/>
+          <w:sz w:val="26"/>
+        </w:rPr>
+        <w:t>16.6. Relacion con los Requerimientos</w:t>
+      </w:r>
+    </w:p>
+    <w:p>
+      <w:pPr>
+        <w:pStyle w:val="ListBullet"/>
+      </w:pPr>
+      <w:r>
+        <w:t>Este documento (levantamiento de requerimientos) es el insumo principal</w:t>
+      </w:r>
+    </w:p>
+    <w:p>
+      <w:pPr>
+        <w:pStyle w:val="ListBullet"/>
+      </w:pPr>
+      <w:r>
+        <w:t>De cada modulo funcional (seccion 12) se derivan una o mas especificaciones</w:t>
+      </w:r>
+    </w:p>
+    <w:p>
+      <w:pPr>
+        <w:pStyle w:val="ListBullet"/>
+      </w:pPr>
+      <w:r>
+        <w:t>Si el documento cambia, se actualizan las especificaciones correspondientes</w:t>
+      </w:r>
+    </w:p>
+    <w:p>
+      <w:pPr>
+        <w:pStyle w:val="ListBullet"/>
+      </w:pPr>
+    </w:p>
+    <w:p>
+      <w:pPr>
+        <w:pStyle w:val="Heading1"/>
+        <w:rPr>
+          <w:b/>
+          <w:sz w:val="32"/>
+        </w:rPr>
+      </w:pPr>
+      <w:r>
+        <w:rPr>
+          <w:b/>
+          <w:sz w:val="32"/>
+        </w:rPr>
+        <w:t>17. Agentes de Desarrollo (Agentes de IA)</w:t>
+      </w:r>
+    </w:p>
+    <w:p>
+      <w:r>
+        <w:t>El proyecto se apoyara en agentes de IA que trabajan guiados por la estructura SDD. Los agentes leen la especificacion, el plan y las tareas, y a partir de eso generan el codigo.</w:t>
+      </w:r>
+    </w:p>
+    <w:p>
+      <w:pPr>
+        <w:pStyle w:val="Heading2"/>
+        <w:rPr>
+          <w:b/>
+          <w:sz w:val="26"/>
+        </w:rPr>
+      </w:pPr>
+      <w:r>
+        <w:rPr>
+          <w:b/>
+          <w:sz w:val="26"/>
+        </w:rPr>
+        <w:t>17.1. Archivo AGENTS.md</w:t>
+      </w:r>
+    </w:p>
+    <w:p>
+      <w:r>
+        <w:t>En la raiz del repositorio se mantiene un archivo AGENTS.md con las instrucciones para los agentes:</w:t>
+      </w:r>
+    </w:p>
+    <w:p>
+      <w:pPr>
+        <w:pStyle w:val="ListBullet"/>
+      </w:pPr>
+      <w:r>
+        <w:t>Descripcion del proyecto y su arquitectura</w:t>
+      </w:r>
+    </w:p>
+    <w:p>
+      <w:pPr>
+        <w:pStyle w:val="ListBullet"/>
+      </w:pPr>
+      <w:r>
+        <w:t>Reglas de codigo: estilo, nombres y estructura de carpetas</w:t>
+      </w:r>
+    </w:p>
+    <w:p>
+      <w:pPr>
+        <w:pStyle w:val="ListBullet"/>
+      </w:pPr>
+      <w:r>
+        <w:t>Tecnologias permitidas (Flutter, Firebase, etc.)</w:t>
+      </w:r>
+    </w:p>
+    <w:p>
+      <w:pPr>
+        <w:pStyle w:val="ListBullet"/>
+      </w:pPr>
+      <w:r>
+        <w:t>Convenciones: commits, ramas, idioma de comentarios y documentacion</w:t>
+      </w:r>
+    </w:p>
+    <w:p>
+      <w:pPr>
+        <w:pStyle w:val="ListBullet"/>
+      </w:pPr>
+      <w:r>
+        <w:t>Prohibiciones: no romper la auditoria, no saltarse el RBAC, no subir secretos</w:t>
+      </w:r>
+    </w:p>
+    <w:p>
+      <w:pPr>
+        <w:pStyle w:val="ListBullet"/>
+      </w:pPr>
+      <w:r>
+        <w:t>Como ejecutar pruebas y compilar el proyecto</w:t>
+      </w:r>
+    </w:p>
+    <w:p>
+      <w:pPr>
+        <w:pStyle w:val="Heading2"/>
+        <w:rPr>
+          <w:b/>
+          <w:sz w:val="26"/>
+        </w:rPr>
+      </w:pPr>
+      <w:r>
+        <w:rPr>
+          <w:b/>
+          <w:sz w:val="26"/>
+        </w:rPr>
+        <w:t>17.2. Agentes Propuestos por Etapa</w:t>
+      </w:r>
+    </w:p>
+    <w:p>
+      <w:pPr>
+        <w:pStyle w:val="ListBullet"/>
+      </w:pPr>
+      <w:r>
+        <w:t>Agente de Especificacion: redacta y refina spec.md</w:t>
+      </w:r>
+    </w:p>
+    <w:p>
+      <w:pPr>
+        <w:pStyle w:val="ListBullet"/>
+      </w:pPr>
+      <w:r>
+        <w:t>Agente de Planificacion: genera plan.md y el modelo de datos</w:t>
+      </w:r>
+    </w:p>
+    <w:p>
+      <w:pPr>
+        <w:pStyle w:val="ListBullet"/>
+      </w:pPr>
+      <w:r>
+        <w:t>Agente de Tareas: desglosa el plan en tasks.md</w:t>
+      </w:r>
+    </w:p>
+    <w:p>
+      <w:pPr>
+        <w:pStyle w:val="ListBullet"/>
+      </w:pPr>
+      <w:r>
+        <w:t>Agente de Implementacion: ejecuta las tareas y escribe el codigo</w:t>
+      </w:r>
+    </w:p>
+    <w:p>
+      <w:pPr>
+        <w:pStyle w:val="ListBullet"/>
+      </w:pPr>
+      <w:r>
+        <w:t>Agente de Pruebas: genera y ejecuta las pruebas</w:t>
+      </w:r>
+    </w:p>
+    <w:p>
+      <w:pPr>
+        <w:pStyle w:val="ListBullet"/>
+      </w:pPr>
+      <w:r>
+        <w:t>Agente de Revision: valida contra la constitucion y los criterios de aceptacion</w:t>
+      </w:r>
+    </w:p>
+    <w:p>
+      <w:pPr>
+        <w:pStyle w:val="Heading2"/>
+        <w:rPr>
+          <w:b/>
+          <w:sz w:val="26"/>
+        </w:rPr>
+      </w:pPr>
+      <w:r>
+        <w:rPr>
+          <w:b/>
+          <w:sz w:val="26"/>
+        </w:rPr>
+        <w:t>17.3. Reglas para los Agentes</w:t>
+      </w:r>
+    </w:p>
+    <w:p>
+      <w:pPr>
+        <w:pStyle w:val="ListBullet"/>
+      </w:pPr>
+      <w:r>
+        <w:t>Nunca implementar sin spec.md y plan.md aprobados</w:t>
+      </w:r>
+    </w:p>
+    <w:p>
+      <w:pPr>
+        <w:pStyle w:val="ListBullet"/>
+      </w:pPr>
+      <w:r>
+        <w:t>Respetar la constitucion del proyecto (constitution.md)</w:t>
+      </w:r>
+    </w:p>
+    <w:p>
+      <w:pPr>
+        <w:pStyle w:val="ListBullet"/>
+      </w:pPr>
+      <w:r>
+        <w:t>Cada tarea debe tener un criterio de terminado claro</w:t>
+      </w:r>
+    </w:p>
+    <w:p>
+      <w:pPr>
+        <w:pStyle w:val="ListBullet"/>
+      </w:pPr>
+      <w:r>
+        <w:t>Multi-tenant: SIEMPRE filtrar por empresaId</w:t>
+      </w:r>
+    </w:p>
+    <w:p>
+      <w:pPr>
+        <w:pStyle w:val="ListBullet"/>
+      </w:pPr>
+      <w:r>
+        <w:t>RBAC: validar permisos por rol en cada funcionalidad</w:t>
+      </w:r>
+    </w:p>
+    <w:p>
+      <w:pPr>
+        <w:pStyle w:val="ListBullet"/>
+      </w:pPr>
+      <w:r>
+        <w:t>Auditoria: toda operacion de escritura debe quedar auditada</w:t>
+      </w:r>
+    </w:p>
+    <w:p>
+      <w:pPr>
+        <w:pStyle w:val="ListBullet"/>
+      </w:pPr>
+      <w:r>
+        <w:t>No subir secretos ni credenciales al repositorio</w:t>
+      </w:r>
+    </w:p>
+    <w:p>
+      <w:pPr>
+        <w:pStyle w:val="ListBullet"/>
+      </w:pPr>
+      <w:r>
+        <w:t>Documentar cada cambio en la funcionalidad correspondiente</w:t>
+      </w:r>
+    </w:p>
+    <w:p>
+      <w:pPr>
+        <w:pStyle w:val="Heading2"/>
+        <w:rPr>
+          <w:b/>
+          <w:sz w:val="26"/>
+        </w:rPr>
+      </w:pPr>
+      <w:r>
+        <w:rPr>
+          <w:b/>
+          <w:sz w:val="26"/>
+        </w:rPr>
+        <w:t>17.4. Ciclo de Trabajo con un Agente</w:t>
+      </w:r>
+    </w:p>
+    <w:p>
+      <w:pPr>
+        <w:pStyle w:val="ListBullet"/>
+      </w:pPr>
+      <w:r>
+        <w:t>1. Se escribe o actualiza la especificacion (spec.md)</w:t>
+      </w:r>
+    </w:p>
+    <w:p>
+      <w:pPr>
+        <w:pStyle w:val="ListBullet"/>
+      </w:pPr>
+      <w:r>
+        <w:t>2. El agente genera o ajusta el plan (plan.md)</w:t>
+      </w:r>
+    </w:p>
+    <w:p>
+      <w:pPr>
+        <w:pStyle w:val="ListBullet"/>
+      </w:pPr>
+      <w:r>
+        <w:t>3. El agente desglosa las tareas (tasks.md)</w:t>
+      </w:r>
+    </w:p>
+    <w:p>
+      <w:pPr>
+        <w:pStyle w:val="ListBullet"/>
+      </w:pPr>
+      <w:r>
+        <w:t>4. El agente implementa tarea por tarea</w:t>
+      </w:r>
+    </w:p>
+    <w:p>
+      <w:pPr>
+        <w:pStyle w:val="ListBullet"/>
+      </w:pPr>
+      <w:r>
+        <w:t>5. Se ejecutan las pruebas y se valida</w:t>
+      </w:r>
+    </w:p>
+    <w:p>
+      <w:pPr>
+        <w:pStyle w:val="ListBullet"/>
+      </w:pPr>
+      <w:r>
+        <w:t>6. Se hace commit y push al repositorio</w:t>
+      </w:r>
+    </w:p>
+    <w:p>
+      <w:pPr>
+        <w:pStyle w:val="ListBullet"/>
+      </w:pPr>
+      <w:r>
+        <w:t>7. Se actualiza la documentacion si aplica</w:t>
+      </w:r>
+    </w:p>
+    <w:p>
+      <w:pPr>
+        <w:pStyle w:val="ListBullet"/>
+      </w:pPr>
     </w:p>
     <w:p>
       <w:pPr>
@@ -5571,7 +6476,7 @@
   <w:abstractNum w:abstractNumId="0" w15:restartNumberingAfterBreak="0">
     <w:nsid w:val="FFFFFF89"/>
     <w:multiLevelType w:val="singleLevel"/>
-    <w:tmpl w:val="D91CA4D2"/>
+    <w:tmpl w:val="42D0AA6A"/>
     <w:lvl w:ilvl="0">
       <w:start w:val="1"/>
       <w:numFmt w:val="bullet"/>
@@ -5590,7 +6495,7 @@
     </w:lvl>
   </w:abstractNum>
   <w:abstractNum w:abstractNumId="1" w15:restartNumberingAfterBreak="0">
-    <w:nsid w:val="17141575"/>
+    <w:nsid w:val="10FF27C7"/>
     <w:multiLevelType w:val="singleLevel"/>
     <w:tmpl w:val="240A0001"/>
     <w:lvl w:ilvl="0">
@@ -5607,7 +6512,7 @@
     </w:lvl>
   </w:abstractNum>
   <w:abstractNum w:abstractNumId="2" w15:restartNumberingAfterBreak="0">
-    <w:nsid w:val="27871403"/>
+    <w:nsid w:val="3E6979D1"/>
     <w:multiLevelType w:val="singleLevel"/>
     <w:tmpl w:val="240A0001"/>
     <w:lvl w:ilvl="0">
@@ -5624,7 +6529,7 @@
     </w:lvl>
   </w:abstractNum>
   <w:abstractNum w:abstractNumId="3" w15:restartNumberingAfterBreak="0">
-    <w:nsid w:val="5F296A53"/>
+    <w:nsid w:val="575D54DF"/>
     <w:multiLevelType w:val="singleLevel"/>
     <w:tmpl w:val="240A0001"/>
     <w:lvl w:ilvl="0">
@@ -5640,17 +6545,17 @@
       </w:rPr>
     </w:lvl>
   </w:abstractNum>
-  <w:num w:numId="1" w16cid:durableId="830754793">
+  <w:num w:numId="1" w16cid:durableId="1563100427">
     <w:abstractNumId w:val="0"/>
   </w:num>
-  <w:num w:numId="2" w16cid:durableId="1630889764">
-    <w:abstractNumId w:val="2"/>
+  <w:num w:numId="2" w16cid:durableId="57746664">
+    <w:abstractNumId w:val="1"/>
   </w:num>
-  <w:num w:numId="3" w16cid:durableId="1461803913">
+  <w:num w:numId="3" w16cid:durableId="445542582">
     <w:abstractNumId w:val="3"/>
   </w:num>
-  <w:num w:numId="4" w16cid:durableId="1512572277">
-    <w:abstractNumId w:val="1"/>
+  <w:num w:numId="4" w16cid:durableId="1616518490">
+    <w:abstractNumId w:val="2"/>
   </w:num>
 </w:numbering>
 </file>
@@ -6063,7 +6968,7 @@
     <w:link w:val="Heading1Char"/>
     <w:uiPriority w:val="9"/>
     <w:qFormat/>
-    <w:rsid w:val="00E94D69"/>
+    <w:rsid w:val="00E977CF"/>
     <w:pPr>
       <w:keepNext/>
       <w:keepLines/>
@@ -6085,7 +6990,7 @@
     <w:uiPriority w:val="9"/>
     <w:unhideWhenUsed/>
     <w:qFormat/>
-    <w:rsid w:val="00E94D69"/>
+    <w:rsid w:val="00E977CF"/>
     <w:pPr>
       <w:keepNext/>
       <w:keepLines/>
@@ -6107,7 +7012,7 @@
     <w:uiPriority w:val="9"/>
     <w:unhideWhenUsed/>
     <w:qFormat/>
-    <w:rsid w:val="00E94D69"/>
+    <w:rsid w:val="00E977CF"/>
     <w:pPr>
       <w:keepNext/>
       <w:keepLines/>
@@ -6130,7 +7035,7 @@
     <w:semiHidden/>
     <w:unhideWhenUsed/>
     <w:qFormat/>
-    <w:rsid w:val="00E94D69"/>
+    <w:rsid w:val="00E977CF"/>
     <w:pPr>
       <w:keepNext/>
       <w:keepLines/>
@@ -6153,7 +7058,7 @@
     <w:semiHidden/>
     <w:unhideWhenUsed/>
     <w:qFormat/>
-    <w:rsid w:val="00E94D69"/>
+    <w:rsid w:val="00E977CF"/>
     <w:pPr>
       <w:keepNext/>
       <w:keepLines/>
@@ -6174,7 +7079,7 @@
     <w:semiHidden/>
     <w:unhideWhenUsed/>
     <w:qFormat/>
-    <w:rsid w:val="00E94D69"/>
+    <w:rsid w:val="00E977CF"/>
     <w:pPr>
       <w:keepNext/>
       <w:keepLines/>
@@ -6197,7 +7102,7 @@
     <w:semiHidden/>
     <w:unhideWhenUsed/>
     <w:qFormat/>
-    <w:rsid w:val="00E94D69"/>
+    <w:rsid w:val="00E977CF"/>
     <w:pPr>
       <w:keepNext/>
       <w:keepLines/>
@@ -6218,7 +7123,7 @@
     <w:semiHidden/>
     <w:unhideWhenUsed/>
     <w:qFormat/>
-    <w:rsid w:val="00E94D69"/>
+    <w:rsid w:val="00E977CF"/>
     <w:pPr>
       <w:keepNext/>
       <w:keepLines/>
@@ -6241,7 +7146,7 @@
     <w:semiHidden/>
     <w:unhideWhenUsed/>
     <w:qFormat/>
-    <w:rsid w:val="00E94D69"/>
+    <w:rsid w:val="00E977CF"/>
     <w:pPr>
       <w:keepNext/>
       <w:keepLines/>
@@ -6285,7 +7190,7 @@
     <w:basedOn w:val="DefaultParagraphFont"/>
     <w:link w:val="Heading1"/>
     <w:uiPriority w:val="9"/>
-    <w:rsid w:val="00E94D69"/>
+    <w:rsid w:val="00E977CF"/>
     <w:rPr>
       <w:rFonts w:asciiTheme="majorHAnsi" w:eastAsiaTheme="majorEastAsia" w:hAnsiTheme="majorHAnsi" w:cstheme="majorBidi"/>
       <w:color w:val="0F4761" w:themeColor="accent1" w:themeShade="BF"/>
@@ -6298,7 +7203,7 @@
     <w:basedOn w:val="DefaultParagraphFont"/>
     <w:link w:val="Heading2"/>
     <w:uiPriority w:val="9"/>
-    <w:rsid w:val="00E94D69"/>
+    <w:rsid w:val="00E977CF"/>
     <w:rPr>
       <w:rFonts w:asciiTheme="majorHAnsi" w:eastAsiaTheme="majorEastAsia" w:hAnsiTheme="majorHAnsi" w:cstheme="majorBidi"/>
       <w:color w:val="0F4761" w:themeColor="accent1" w:themeShade="BF"/>
@@ -6311,7 +7216,7 @@
     <w:basedOn w:val="DefaultParagraphFont"/>
     <w:link w:val="Heading3"/>
     <w:uiPriority w:val="9"/>
-    <w:rsid w:val="00E94D69"/>
+    <w:rsid w:val="00E977CF"/>
     <w:rPr>
       <w:rFonts w:eastAsiaTheme="majorEastAsia" w:cstheme="majorBidi"/>
       <w:color w:val="0F4761" w:themeColor="accent1" w:themeShade="BF"/>
@@ -6325,7 +7230,7 @@
     <w:link w:val="Heading4"/>
     <w:uiPriority w:val="9"/>
     <w:semiHidden/>
-    <w:rsid w:val="00E94D69"/>
+    <w:rsid w:val="00E977CF"/>
     <w:rPr>
       <w:rFonts w:eastAsiaTheme="majorEastAsia" w:cstheme="majorBidi"/>
       <w:i/>
@@ -6339,7 +7244,7 @@
     <w:link w:val="Heading5"/>
     <w:uiPriority w:val="9"/>
     <w:semiHidden/>
-    <w:rsid w:val="00E94D69"/>
+    <w:rsid w:val="00E977CF"/>
     <w:rPr>
       <w:rFonts w:eastAsiaTheme="majorEastAsia" w:cstheme="majorBidi"/>
       <w:color w:val="0F4761" w:themeColor="accent1" w:themeShade="BF"/>
@@ -6351,7 +7256,7 @@
     <w:link w:val="Heading6"/>
     <w:uiPriority w:val="9"/>
     <w:semiHidden/>
-    <w:rsid w:val="00E94D69"/>
+    <w:rsid w:val="00E977CF"/>
     <w:rPr>
       <w:rFonts w:eastAsiaTheme="majorEastAsia" w:cstheme="majorBidi"/>
       <w:i/>
@@ -6365,7 +7270,7 @@
     <w:link w:val="Heading7"/>
     <w:uiPriority w:val="9"/>
     <w:semiHidden/>
-    <w:rsid w:val="00E94D69"/>
+    <w:rsid w:val="00E977CF"/>
     <w:rPr>
       <w:rFonts w:eastAsiaTheme="majorEastAsia" w:cstheme="majorBidi"/>
       <w:color w:val="595959" w:themeColor="text1" w:themeTint="A6"/>
@@ -6377,7 +7282,7 @@
     <w:link w:val="Heading8"/>
     <w:uiPriority w:val="9"/>
     <w:semiHidden/>
-    <w:rsid w:val="00E94D69"/>
+    <w:rsid w:val="00E977CF"/>
     <w:rPr>
       <w:rFonts w:eastAsiaTheme="majorEastAsia" w:cstheme="majorBidi"/>
       <w:i/>
@@ -6391,7 +7296,7 @@
     <w:link w:val="Heading9"/>
     <w:uiPriority w:val="9"/>
     <w:semiHidden/>
-    <w:rsid w:val="00E94D69"/>
+    <w:rsid w:val="00E977CF"/>
     <w:rPr>
       <w:rFonts w:eastAsiaTheme="majorEastAsia" w:cstheme="majorBidi"/>
       <w:color w:val="272727" w:themeColor="text1" w:themeTint="D8"/>
@@ -6404,7 +7309,7 @@
     <w:link w:val="TitleChar"/>
     <w:uiPriority w:val="10"/>
     <w:qFormat/>
-    <w:rsid w:val="00E94D69"/>
+    <w:rsid w:val="00E977CF"/>
     <w:pPr>
       <w:spacing w:after="80" w:line="240" w:lineRule="auto"/>
       <w:contextualSpacing/>
@@ -6422,7 +7327,7 @@
     <w:basedOn w:val="DefaultParagraphFont"/>
     <w:link w:val="Title"/>
     <w:uiPriority w:val="10"/>
-    <w:rsid w:val="00E94D69"/>
+    <w:rsid w:val="00E977CF"/>
     <w:rPr>
       <w:rFonts w:asciiTheme="majorHAnsi" w:eastAsiaTheme="majorEastAsia" w:hAnsiTheme="majorHAnsi" w:cstheme="majorBidi"/>
       <w:spacing w:val="-10"/>
@@ -6438,7 +7343,7 @@
     <w:link w:val="SubtitleChar"/>
     <w:uiPriority w:val="11"/>
     <w:qFormat/>
-    <w:rsid w:val="00E94D69"/>
+    <w:rsid w:val="00E977CF"/>
     <w:pPr>
       <w:numPr>
         <w:ilvl w:val="1"/>
@@ -6457,7 +7362,7 @@
     <w:basedOn w:val="DefaultParagraphFont"/>
     <w:link w:val="Subtitle"/>
     <w:uiPriority w:val="11"/>
-    <w:rsid w:val="00E94D69"/>
+    <w:rsid w:val="00E977CF"/>
     <w:rPr>
       <w:rFonts w:eastAsiaTheme="majorEastAsia" w:cstheme="majorBidi"/>
       <w:color w:val="595959" w:themeColor="text1" w:themeTint="A6"/>
@@ -6473,7 +7378,7 @@
     <w:link w:val="QuoteChar"/>
     <w:uiPriority w:val="29"/>
     <w:qFormat/>
-    <w:rsid w:val="00E94D69"/>
+    <w:rsid w:val="00E977CF"/>
     <w:pPr>
       <w:spacing w:before="160"/>
       <w:jc w:val="center"/>
@@ -6489,7 +7394,7 @@
     <w:basedOn w:val="DefaultParagraphFont"/>
     <w:link w:val="Quote"/>
     <w:uiPriority w:val="29"/>
-    <w:rsid w:val="00E94D69"/>
+    <w:rsid w:val="00E977CF"/>
     <w:rPr>
       <w:i/>
       <w:iCs/>
@@ -6501,7 +7406,7 @@
     <w:basedOn w:val="Normal"/>
     <w:uiPriority w:val="34"/>
     <w:qFormat/>
-    <w:rsid w:val="00E94D69"/>
+    <w:rsid w:val="00E977CF"/>
     <w:pPr>
       <w:ind w:left="720"/>
       <w:contextualSpacing/>
@@ -6512,7 +7417,7 @@
     <w:basedOn w:val="DefaultParagraphFont"/>
     <w:uiPriority w:val="21"/>
     <w:qFormat/>
-    <w:rsid w:val="00E94D69"/>
+    <w:rsid w:val="00E977CF"/>
     <w:rPr>
       <w:i/>
       <w:iCs/>
@@ -6526,7 +7431,7 @@
     <w:link w:val="IntenseQuoteChar"/>
     <w:uiPriority w:val="30"/>
     <w:qFormat/>
-    <w:rsid w:val="00E94D69"/>
+    <w:rsid w:val="00E977CF"/>
     <w:pPr>
       <w:pBdr>
         <w:top w:val="single" w:sz="4" w:space="10" w:color="0F4761" w:themeColor="accent1" w:themeShade="BF"/>
@@ -6547,7 +7452,7 @@
     <w:basedOn w:val="DefaultParagraphFont"/>
     <w:link w:val="IntenseQuote"/>
     <w:uiPriority w:val="30"/>
-    <w:rsid w:val="00E94D69"/>
+    <w:rsid w:val="00E977CF"/>
     <w:rPr>
       <w:i/>
       <w:iCs/>
@@ -6559,7 +7464,7 @@
     <w:basedOn w:val="DefaultParagraphFont"/>
     <w:uiPriority w:val="32"/>
     <w:qFormat/>
-    <w:rsid w:val="00E94D69"/>
+    <w:rsid w:val="00E977CF"/>
     <w:rPr>
       <w:b/>
       <w:bCs/>
@@ -6573,7 +7478,7 @@
     <w:basedOn w:val="Normal"/>
     <w:uiPriority w:val="99"/>
     <w:unhideWhenUsed/>
-    <w:rsid w:val="00E94D69"/>
+    <w:rsid w:val="00E977CF"/>
     <w:pPr>
       <w:numPr>
         <w:numId w:val="1"/>

</xml_diff>